<commit_message>
chore: update gitignore, templates, and config.ini line ending
- Broaden gitignore to ignore all PDFs/data/ files
- Update plantilla.docx templates across all grade groups
- Fix missing newline at EOF in Reporte/config.ini
</commit_message>
<xml_diff>
--- a/PDFs/config/1° a 7°/plantilla.docx
+++ b/PDFs/config/1° a 7°/plantilla.docx
@@ -1,6 +1,6 @@
 
 <file path=word/document.xml><?xml version="1.0" encoding="utf-8"?>
-<w:document xmlns:wpc="http://schemas.microsoft.com/office/word/2010/wordprocessingCanvas" xmlns:cx="http://schemas.microsoft.com/office/drawing/2014/chartex" xmlns:cx1="http://schemas.microsoft.com/office/drawing/2015/9/8/chartex" xmlns:cx2="http://schemas.microsoft.com/office/drawing/2015/10/21/chartex" xmlns:cx3="http://schemas.microsoft.com/office/drawing/2016/5/9/chartex" xmlns:cx4="http://schemas.microsoft.com/office/drawing/2016/5/10/chartex" xmlns:cx5="http://schemas.microsoft.com/office/drawing/2016/5/11/chartex" xmlns:cx6="http://schemas.microsoft.com/office/drawing/2016/5/12/chartex" xmlns:cx7="http://schemas.microsoft.com/office/drawing/2016/5/13/chartex" xmlns:cx8="http://schemas.microsoft.com/office/drawing/2016/5/14/chartex" xmlns:mc="http://schemas.openxmlformats.org/markup-compatibility/2006" xmlns:aink="http://schemas.microsoft.com/office/drawing/2016/ink" xmlns:am3d="http://schemas.microsoft.com/office/drawing/2017/model3d" xmlns:o="urn:schemas-microsoft-com:office:office" xmlns:oel="http://schemas.microsoft.com/office/2019/extlst" xmlns:r="http://schemas.openxmlformats.org/officeDocument/2006/relationships" xmlns:m="http://schemas.openxmlformats.org/officeDocument/2006/math" xmlns:v="urn:schemas-microsoft-com:vml" xmlns:wp14="http://schemas.microsoft.com/office/word/2010/wordprocessingDrawing" xmlns:wp="http://schemas.openxmlformats.org/drawingml/2006/wordprocessingDrawing" xmlns:w10="urn:schemas-microsoft-com:office:word" xmlns:w="http://schemas.openxmlformats.org/wordprocessingml/2006/main" xmlns:w14="http://schemas.microsoft.com/office/word/2010/wordml" xmlns:w15="http://schemas.microsoft.com/office/word/2012/wordml" xmlns:w16cex="http://schemas.microsoft.com/office/word/2018/wordml/cex" xmlns:w16cid="http://schemas.microsoft.com/office/word/2016/wordml/cid" xmlns:w16="http://schemas.microsoft.com/office/word/2018/wordml" xmlns:w16du="http://schemas.microsoft.com/office/word/2023/wordml/word16du" xmlns:w16sdtdh="http://schemas.microsoft.com/office/word/2020/wordml/sdtdatahash" xmlns:w16sdtfl="http://schemas.microsoft.com/office/word/2024/wordml/sdtformatlock" xmlns:w16se="http://schemas.microsoft.com/office/word/2015/wordml/symex" xmlns:wpg="http://schemas.microsoft.com/office/word/2010/wordprocessingGroup" xmlns:wpi="http://schemas.microsoft.com/office/word/2010/wordprocessingInk" xmlns:wne="http://schemas.microsoft.com/office/word/2006/wordml" xmlns:wps="http://schemas.microsoft.com/office/word/2010/wordprocessingShape" mc:Ignorable="w14 w15 w16se w16cid w16 w16cex w16sdtdh w16sdtfl w16du wp14">
+<w:document xmlns:wpc="http://schemas.microsoft.com/office/word/2010/wordprocessingCanvas" xmlns:cx="http://schemas.microsoft.com/office/drawing/2014/chartex" xmlns:cx1="http://schemas.microsoft.com/office/drawing/2015/9/8/chartex" xmlns:cx2="http://schemas.microsoft.com/office/drawing/2015/10/21/chartex" xmlns:cx3="http://schemas.microsoft.com/office/drawing/2016/5/9/chartex" xmlns:cx4="http://schemas.microsoft.com/office/drawing/2016/5/10/chartex" xmlns:cx5="http://schemas.microsoft.com/office/drawing/2016/5/11/chartex" xmlns:cx6="http://schemas.microsoft.com/office/drawing/2016/5/12/chartex" xmlns:cx7="http://schemas.microsoft.com/office/drawing/2016/5/13/chartex" xmlns:cx8="http://schemas.microsoft.com/office/drawing/2016/5/14/chartex" xmlns:mc="http://schemas.openxmlformats.org/markup-compatibility/2006" xmlns:aink="http://schemas.microsoft.com/office/drawing/2016/ink" xmlns:am3d="http://schemas.microsoft.com/office/drawing/2017/model3d" xmlns:o="urn:schemas-microsoft-com:office:office" xmlns:r="http://schemas.openxmlformats.org/officeDocument/2006/relationships" xmlns:m="http://schemas.openxmlformats.org/officeDocument/2006/math" xmlns:v="urn:schemas-microsoft-com:vml" xmlns:wp14="http://schemas.microsoft.com/office/word/2010/wordprocessingDrawing" xmlns:wp="http://schemas.openxmlformats.org/drawingml/2006/wordprocessingDrawing" xmlns:w10="urn:schemas-microsoft-com:office:word" xmlns:w="http://schemas.openxmlformats.org/wordprocessingml/2006/main" xmlns:w14="http://schemas.microsoft.com/office/word/2010/wordml" xmlns:w15="http://schemas.microsoft.com/office/word/2012/wordml" xmlns:w16cex="http://schemas.microsoft.com/office/word/2018/wordml/cex" xmlns:w16cid="http://schemas.microsoft.com/office/word/2016/wordml/cid" xmlns:w16="http://schemas.microsoft.com/office/word/2018/wordml" xmlns:w16sdtdh="http://schemas.microsoft.com/office/word/2020/wordml/sdtdatahash" xmlns:w16se="http://schemas.microsoft.com/office/word/2015/wordml/symex" xmlns:wpg="http://schemas.microsoft.com/office/word/2010/wordprocessingGroup" xmlns:wpi="http://schemas.microsoft.com/office/word/2010/wordprocessingInk" xmlns:wne="http://schemas.microsoft.com/office/word/2006/wordml" xmlns:wps="http://schemas.microsoft.com/office/word/2010/wordprocessingShape" mc:Ignorable="w14 w15 w16se w16cid w16 w16cex w16sdtdh wp14">
   <w:background w:color="EDEDED" w:themeColor="accent3" w:themeTint="33"/>
   <w:body>
     <w:p>
@@ -265,7 +265,7 @@
                 <v:stroke joinstyle="miter"/>
                 <v:path gradientshapeok="t" o:connecttype="rect"/>
               </v:shapetype>
-              <v:shape id="Text Box 28" o:spid="_x0000_s1026" type="#_x0000_t202" style="position:absolute;margin-left:231.2pt;margin-top:-43.15pt;width:337.75pt;height:137.75pt;z-index:251596288;visibility:visible;mso-wrap-style:square;mso-width-percent:0;mso-height-percent:0;mso-wrap-distance-left:9pt;mso-wrap-distance-top:0;mso-wrap-distance-right:9pt;mso-wrap-distance-bottom:0;mso-position-horizontal:absolute;mso-position-horizontal-relative:page;mso-position-vertical:absolute;mso-position-vertical-relative:text;mso-width-percent:0;mso-height-percent:0;mso-width-relative:margin;mso-height-relative:margin;v-text-anchor:top" o:gfxdata="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" filled="f" stroked="f">
+              <v:shape id="Text Box 28" o:spid="_x0000_s1026" type="#_x0000_t202" style="position:absolute;margin-left:231.2pt;margin-top:-43.15pt;width:337.75pt;height:137.75pt;z-index:251596288;visibility:visible;mso-wrap-style:square;mso-width-percent:0;mso-height-percent:0;mso-wrap-distance-left:9pt;mso-wrap-distance-top:0;mso-wrap-distance-right:9pt;mso-wrap-distance-bottom:0;mso-position-horizontal:absolute;mso-position-horizontal-relative:page;mso-position-vertical:absolute;mso-position-vertical-relative:text;mso-width-percent:0;mso-height-percent:0;mso-width-relative:margin;mso-height-relative:margin;v-text-anchor:top" o:gfxdata="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" filled="f" stroked="f">
                 <v:textbox>
                   <w:txbxContent>
                     <w:p>
@@ -545,7 +545,7 @@
           </mc:Choice>
           <mc:Fallback>
             <w:pict>
-              <v:shape w14:anchorId="055FE733" id="Text Box 25" o:spid="_x0000_s1027" type="#_x0000_t202" style="position:absolute;margin-left:-61.75pt;margin-top:20.15pt;width:32.35pt;height:24.15pt;z-index:251607552;visibility:visible;mso-wrap-style:square;mso-width-percent:0;mso-wrap-distance-left:9pt;mso-wrap-distance-top:0;mso-wrap-distance-right:9pt;mso-wrap-distance-bottom:0;mso-position-horizontal:absolute;mso-position-horizontal-relative:text;mso-position-vertical:absolute;mso-position-vertical-relative:text;mso-width-percent:0;mso-width-relative:margin;v-text-anchor:top" o:gfxdata="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" filled="f" stroked="f">
+              <v:shape w14:anchorId="055FE733" id="Text Box 25" o:spid="_x0000_s1027" type="#_x0000_t202" style="position:absolute;margin-left:-61.75pt;margin-top:20.15pt;width:32.35pt;height:24.15pt;z-index:251607552;visibility:visible;mso-wrap-style:square;mso-width-percent:0;mso-wrap-distance-left:9pt;mso-wrap-distance-top:0;mso-wrap-distance-right:9pt;mso-wrap-distance-bottom:0;mso-position-horizontal:absolute;mso-position-horizontal-relative:text;mso-position-vertical:absolute;mso-position-vertical-relative:text;mso-width-percent:0;mso-width-relative:margin;v-text-anchor:top" o:gfxdata="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" filled="f" stroked="f">
                 <v:textbox style="mso-fit-shape-to-text:t">
                   <w:txbxContent>
                     <w:p>
@@ -704,7 +704,7 @@
               </wp:anchor>
             </w:drawing>
           </mc:Choice>
-          <mc:Fallback>
+          <mc:Fallback xmlns:w16sdtfl="http://schemas.microsoft.com/office/word/2024/wordml/sdtformatlock" xmlns:w16du="http://schemas.microsoft.com/office/word/2023/wordml/word16du" xmlns:oel="http://schemas.microsoft.com/office/2019/extlst">
             <w:pict>
               <v:group w14:anchorId="6A932439" id="Grupo 55" o:spid="_x0000_s1026" style="position:absolute;margin-left:-49.35pt;margin-top:27.1pt;width:186.55pt;height:30.55pt;z-index:251592192" coordsize="23693,3881" o:gfxdata="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">
                 <v:shapetype id="_x0000_t116" coordsize="21600,21600" o:spt="116" path="m3475,qx,10800,3475,21600l18125,21600qx21600,10800,18125,xe">
@@ -793,7 +793,7 @@
               </wp:anchor>
             </w:drawing>
           </mc:Choice>
-          <mc:Fallback>
+          <mc:Fallback xmlns:w16sdtfl="http://schemas.microsoft.com/office/word/2024/wordml/sdtformatlock" xmlns:w16du="http://schemas.microsoft.com/office/word/2023/wordml/word16du" xmlns:oel="http://schemas.microsoft.com/office/2019/extlst">
             <w:pict>
               <v:oval w14:anchorId="1CFD3D1F" id="Elipse 50" o:spid="_x0000_s1026" style="position:absolute;margin-left:19.25pt;margin-top:22.55pt;width:41.1pt;height:40.9pt;z-index:251606528;visibility:visible;mso-wrap-style:square;mso-width-percent:0;mso-height-percent:0;mso-wrap-distance-left:9pt;mso-wrap-distance-top:0;mso-wrap-distance-right:9pt;mso-wrap-distance-bottom:0;mso-position-horizontal:absolute;mso-position-horizontal-relative:left-margin-area;mso-position-vertical:absolute;mso-position-vertical-relative:text;mso-width-percent:0;mso-height-percent:0;mso-width-relative:margin;mso-height-relative:margin;v-text-anchor:middle" o:gfxdata="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" fillcolor="#5053a4" strokecolor="white [3212]" strokeweight="1pt">
                 <v:stroke joinstyle="miter"/>
@@ -880,7 +880,7 @@
               </wp:anchor>
             </w:drawing>
           </mc:Choice>
-          <mc:Fallback>
+          <mc:Fallback xmlns:w16sdtfl="http://schemas.microsoft.com/office/word/2024/wordml/sdtformatlock" xmlns:w16du="http://schemas.microsoft.com/office/word/2023/wordml/word16du" xmlns:oel="http://schemas.microsoft.com/office/2019/extlst">
             <w:pict>
               <v:roundrect w14:anchorId="3CCA1BE1" id="Rectángulo redondeado 56" o:spid="_x0000_s1026" style="position:absolute;margin-left:-61.8pt;margin-top:19.55pt;width:386.3pt;height:109.65pt;z-index:251591168;visibility:visible;mso-wrap-style:square;mso-width-percent:0;mso-height-percent:0;mso-wrap-distance-left:9pt;mso-wrap-distance-top:0;mso-wrap-distance-right:9pt;mso-wrap-distance-bottom:0;mso-position-horizontal:absolute;mso-position-horizontal-relative:text;mso-position-vertical:absolute;mso-position-vertical-relative:text;mso-width-percent:0;mso-height-percent:0;mso-width-relative:margin;mso-height-relative:margin;v-text-anchor:middle" arcsize="10923f" o:gfxdata="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" fillcolor="white [3212]" strokecolor="#5053a4" strokeweight="1pt">
                 <v:stroke joinstyle="miter"/>
@@ -1012,7 +1012,7 @@
           </mc:Choice>
           <mc:Fallback>
             <w:pict>
-              <v:shape w14:anchorId="116CCDDF" id="Cuadro de texto 39" o:spid="_x0000_s1028" type="#_x0000_t202" style="position:absolute;margin-left:458.5pt;margin-top:13.8pt;width:53.4pt;height:33.65pt;z-index:251604480;visibility:visible;mso-wrap-style:square;mso-width-percent:0;mso-height-percent:0;mso-wrap-distance-left:9pt;mso-wrap-distance-top:3.6pt;mso-wrap-distance-right:9pt;mso-wrap-distance-bottom:3.6pt;mso-position-horizontal:absolute;mso-position-horizontal-relative:left-margin-area;mso-position-vertical:absolute;mso-position-vertical-relative:text;mso-width-percent:0;mso-height-percent:0;mso-width-relative:margin;mso-height-relative:margin;v-text-anchor:top" o:gfxdata="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" filled="f" stroked="f">
+              <v:shape w14:anchorId="116CCDDF" id="Cuadro de texto 39" o:spid="_x0000_s1028" type="#_x0000_t202" style="position:absolute;margin-left:458.5pt;margin-top:13.8pt;width:53.4pt;height:33.65pt;z-index:251604480;visibility:visible;mso-wrap-style:square;mso-width-percent:0;mso-height-percent:0;mso-wrap-distance-left:9pt;mso-wrap-distance-top:3.6pt;mso-wrap-distance-right:9pt;mso-wrap-distance-bottom:3.6pt;mso-position-horizontal:absolute;mso-position-horizontal-relative:left-margin-area;mso-position-vertical:absolute;mso-position-vertical-relative:text;mso-width-percent:0;mso-height-percent:0;mso-width-relative:margin;mso-height-relative:margin;v-text-anchor:top" o:gfxdata="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" filled="f" stroked="f">
                 <v:textbox>
                   <w:txbxContent>
                     <w:p>
@@ -1146,7 +1146,7 @@
           </mc:Choice>
           <mc:Fallback>
             <w:pict>
-              <v:shape w14:anchorId="4B05C675" id="_x0000_s1029" type="#_x0000_t202" style="position:absolute;margin-left:-33.5pt;margin-top:6.85pt;width:174.05pt;height:24.15pt;z-index:251599360;visibility:visible;mso-wrap-style:square;mso-width-percent:0;mso-wrap-distance-left:9pt;mso-wrap-distance-top:0;mso-wrap-distance-right:9pt;mso-wrap-distance-bottom:0;mso-position-horizontal:absolute;mso-position-horizontal-relative:text;mso-position-vertical:absolute;mso-position-vertical-relative:text;mso-width-percent:0;mso-width-relative:margin;v-text-anchor:top" o:gfxdata="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" filled="f" stroked="f">
+              <v:shape w14:anchorId="4B05C675" id="_x0000_s1029" type="#_x0000_t202" style="position:absolute;margin-left:-33.5pt;margin-top:6.85pt;width:174.05pt;height:24.15pt;z-index:251599360;visibility:visible;mso-wrap-style:square;mso-width-percent:0;mso-wrap-distance-left:9pt;mso-wrap-distance-top:0;mso-wrap-distance-right:9pt;mso-wrap-distance-bottom:0;mso-position-horizontal:absolute;mso-position-horizontal-relative:text;mso-position-vertical:absolute;mso-position-vertical-relative:text;mso-width-percent:0;mso-width-relative:margin;v-text-anchor:top" o:gfxdata="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" filled="f" stroked="f">
                 <v:textbox style="mso-fit-shape-to-text:t">
                   <w:txbxContent>
                     <w:p>
@@ -1533,7 +1533,7 @@
           </mc:Choice>
           <mc:Fallback>
             <w:pict>
-              <v:shape w14:anchorId="5CBC4DC2" id="Cuadro de texto 2" o:spid="_x0000_s1030" type="#_x0000_t202" style="position:absolute;margin-left:-51.3pt;margin-top:22.95pt;width:243.75pt;height:42.55pt;z-index:251602432;visibility:visible;mso-wrap-style:square;mso-width-percent:0;mso-height-percent:0;mso-wrap-distance-left:9pt;mso-wrap-distance-top:3.6pt;mso-wrap-distance-right:9pt;mso-wrap-distance-bottom:3.6pt;mso-position-horizontal:absolute;mso-position-horizontal-relative:text;mso-position-vertical:absolute;mso-position-vertical-relative:text;mso-width-percent:0;mso-height-percent:0;mso-width-relative:margin;mso-height-relative:margin;v-text-anchor:top" o:gfxdata="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" filled="f" stroked="f">
+              <v:shape w14:anchorId="5CBC4DC2" id="Cuadro de texto 2" o:spid="_x0000_s1030" type="#_x0000_t202" style="position:absolute;margin-left:-51.3pt;margin-top:22.95pt;width:243.75pt;height:42.55pt;z-index:251602432;visibility:visible;mso-wrap-style:square;mso-width-percent:0;mso-height-percent:0;mso-wrap-distance-left:9pt;mso-wrap-distance-top:3.6pt;mso-wrap-distance-right:9pt;mso-wrap-distance-bottom:3.6pt;mso-position-horizontal:absolute;mso-position-horizontal-relative:text;mso-position-vertical:absolute;mso-position-vertical-relative:text;mso-width-percent:0;mso-height-percent:0;mso-width-relative:margin;mso-height-relative:margin;v-text-anchor:top" o:gfxdata="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" filled="f" stroked="f">
                 <v:textbox>
                   <w:txbxContent>
                     <w:p>
@@ -1844,7 +1844,7 @@
           </mc:Choice>
           <mc:Fallback>
             <w:pict>
-              <v:shape w14:anchorId="56F1CDBE" id="_x0000_s1031" type="#_x0000_t202" style="position:absolute;margin-left:177.95pt;margin-top:18.25pt;width:123.6pt;height:60.35pt;z-index:251660800;visibility:visible;mso-wrap-style:square;mso-width-percent:0;mso-height-percent:0;mso-wrap-distance-left:9pt;mso-wrap-distance-top:3.6pt;mso-wrap-distance-right:9pt;mso-wrap-distance-bottom:3.6pt;mso-position-horizontal:absolute;mso-position-horizontal-relative:text;mso-position-vertical:absolute;mso-position-vertical-relative:text;mso-width-percent:0;mso-height-percent:0;mso-width-relative:margin;mso-height-relative:margin;v-text-anchor:top" o:gfxdata="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" filled="f" stroked="f">
+              <v:shape w14:anchorId="56F1CDBE" id="_x0000_s1031" type="#_x0000_t202" style="position:absolute;margin-left:177.95pt;margin-top:18.25pt;width:123.6pt;height:60.35pt;z-index:251660800;visibility:visible;mso-wrap-style:square;mso-width-percent:0;mso-height-percent:0;mso-wrap-distance-left:9pt;mso-wrap-distance-top:3.6pt;mso-wrap-distance-right:9pt;mso-wrap-distance-bottom:3.6pt;mso-position-horizontal:absolute;mso-position-horizontal-relative:text;mso-position-vertical:absolute;mso-position-vertical-relative:text;mso-width-percent:0;mso-height-percent:0;mso-width-relative:margin;mso-height-relative:margin;v-text-anchor:top" o:gfxdata="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" filled="f" stroked="f">
                 <v:textbox>
                   <w:txbxContent>
                     <w:p>
@@ -2072,7 +2072,7 @@
           </mc:Choice>
           <mc:Fallback>
             <w:pict>
-              <v:shape w14:anchorId="55959A35" id="_x0000_s1032" type="#_x0000_t202" style="position:absolute;margin-left:179.9pt;margin-top:.55pt;width:123.6pt;height:24.9pt;z-index:251603456;visibility:visible;mso-wrap-style:square;mso-width-percent:0;mso-height-percent:0;mso-wrap-distance-left:9pt;mso-wrap-distance-top:3.6pt;mso-wrap-distance-right:9pt;mso-wrap-distance-bottom:3.6pt;mso-position-horizontal:absolute;mso-position-horizontal-relative:text;mso-position-vertical:absolute;mso-position-vertical-relative:text;mso-width-percent:0;mso-height-percent:0;mso-width-relative:margin;mso-height-relative:margin;v-text-anchor:top" o:gfxdata="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" filled="f" stroked="f">
+              <v:shape w14:anchorId="55959A35" id="_x0000_s1032" type="#_x0000_t202" style="position:absolute;margin-left:179.9pt;margin-top:.55pt;width:123.6pt;height:24.9pt;z-index:251603456;visibility:visible;mso-wrap-style:square;mso-width-percent:0;mso-height-percent:0;mso-wrap-distance-left:9pt;mso-wrap-distance-top:3.6pt;mso-wrap-distance-right:9pt;mso-wrap-distance-bottom:3.6pt;mso-position-horizontal:absolute;mso-position-horizontal-relative:text;mso-position-vertical:absolute;mso-position-vertical-relative:text;mso-width-percent:0;mso-height-percent:0;mso-width-relative:margin;mso-height-relative:margin;v-text-anchor:top" o:gfxdata="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" filled="f" stroked="f">
                 <v:textbox>
                   <w:txbxContent>
                     <w:p>
@@ -2191,7 +2191,7 @@
           </mc:Choice>
           <mc:Fallback>
             <w:pict>
-              <v:shape w14:anchorId="14D39D47" id="_x0000_s1033" type="#_x0000_t202" style="position:absolute;margin-left:354.05pt;margin-top:20.9pt;width:72.7pt;height:22.35pt;z-index:251600384;visibility:visible;mso-wrap-style:square;mso-width-percent:0;mso-height-percent:0;mso-wrap-distance-left:9pt;mso-wrap-distance-top:0;mso-wrap-distance-right:9pt;mso-wrap-distance-bottom:0;mso-position-horizontal:absolute;mso-position-horizontal-relative:text;mso-position-vertical:absolute;mso-position-vertical-relative:text;mso-width-percent:0;mso-height-percent:0;mso-width-relative:margin;mso-height-relative:margin;v-text-anchor:top" o:gfxdata="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" filled="f" stroked="f">
+              <v:shape w14:anchorId="14D39D47" id="_x0000_s1033" type="#_x0000_t202" style="position:absolute;margin-left:354.05pt;margin-top:20.9pt;width:72.7pt;height:22.35pt;z-index:251600384;visibility:visible;mso-wrap-style:square;mso-width-percent:0;mso-height-percent:0;mso-wrap-distance-left:9pt;mso-wrap-distance-top:0;mso-wrap-distance-right:9pt;mso-wrap-distance-bottom:0;mso-position-horizontal:absolute;mso-position-horizontal-relative:text;mso-position-vertical:absolute;mso-position-vertical-relative:text;mso-width-percent:0;mso-height-percent:0;mso-width-relative:margin;mso-height-relative:margin;v-text-anchor:top" o:gfxdata="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" filled="f" stroked="f">
                 <v:textbox>
                   <w:txbxContent>
                     <w:p>
@@ -2369,7 +2369,7 @@
           </mc:Choice>
           <mc:Fallback>
             <w:pict>
-              <v:shape w14:anchorId="23827715" id="_x0000_s1034" type="#_x0000_t202" style="position:absolute;margin-left:45.25pt;margin-top:12.55pt;width:121.55pt;height:42.55pt;z-index:251712000;visibility:visible;mso-wrap-style:square;mso-width-percent:0;mso-height-percent:0;mso-wrap-distance-left:9pt;mso-wrap-distance-top:3.6pt;mso-wrap-distance-right:9pt;mso-wrap-distance-bottom:3.6pt;mso-position-horizontal:absolute;mso-position-horizontal-relative:text;mso-position-vertical:absolute;mso-position-vertical-relative:text;mso-width-percent:0;mso-height-percent:0;mso-width-relative:margin;mso-height-relative:margin;v-text-anchor:top" o:gfxdata="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" filled="f" stroked="f">
+              <v:shape w14:anchorId="23827715" id="_x0000_s1034" type="#_x0000_t202" style="position:absolute;margin-left:45.25pt;margin-top:12.55pt;width:121.55pt;height:42.55pt;z-index:251712000;visibility:visible;mso-wrap-style:square;mso-width-percent:0;mso-height-percent:0;mso-wrap-distance-left:9pt;mso-wrap-distance-top:3.6pt;mso-wrap-distance-right:9pt;mso-wrap-distance-bottom:3.6pt;mso-position-horizontal:absolute;mso-position-horizontal-relative:text;mso-position-vertical:absolute;mso-position-vertical-relative:text;mso-width-percent:0;mso-height-percent:0;mso-width-relative:margin;mso-height-relative:margin;v-text-anchor:top" o:gfxdata="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" filled="f" stroked="f">
                 <v:textbox>
                   <w:txbxContent>
                     <w:p>
@@ -2586,7 +2586,7 @@
           </mc:Choice>
           <mc:Fallback>
             <w:pict>
-              <v:shape w14:anchorId="2CE81A07" id="_x0000_s1035" type="#_x0000_t202" style="position:absolute;margin-left:-51.65pt;margin-top:12.55pt;width:111.85pt;height:42.55pt;z-index:251675136;visibility:visible;mso-wrap-style:square;mso-width-percent:0;mso-height-percent:0;mso-wrap-distance-left:9pt;mso-wrap-distance-top:3.6pt;mso-wrap-distance-right:9pt;mso-wrap-distance-bottom:3.6pt;mso-position-horizontal:absolute;mso-position-horizontal-relative:text;mso-position-vertical:absolute;mso-position-vertical-relative:text;mso-width-percent:0;mso-height-percent:0;mso-width-relative:margin;mso-height-relative:margin;v-text-anchor:top" o:gfxdata="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" filled="f" stroked="f">
+              <v:shape w14:anchorId="2CE81A07" id="_x0000_s1035" type="#_x0000_t202" style="position:absolute;margin-left:-51.65pt;margin-top:12.55pt;width:111.85pt;height:42.55pt;z-index:251675136;visibility:visible;mso-wrap-style:square;mso-width-percent:0;mso-height-percent:0;mso-wrap-distance-left:9pt;mso-wrap-distance-top:3.6pt;mso-wrap-distance-right:9pt;mso-wrap-distance-bottom:3.6pt;mso-position-horizontal:absolute;mso-position-horizontal-relative:text;mso-position-vertical:absolute;mso-position-vertical-relative:text;mso-width-percent:0;mso-height-percent:0;mso-width-relative:margin;mso-height-relative:margin;v-text-anchor:top" o:gfxdata="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" filled="f" stroked="f">
                 <v:textbox>
                   <w:txbxContent>
                     <w:p>
@@ -2740,7 +2740,7 @@
           </mc:Choice>
           <mc:Fallback>
             <w:pict>
-              <v:shape w14:anchorId="1BD27A19" id="_x0000_s1036" type="#_x0000_t202" style="position:absolute;margin-left:412.95pt;margin-top:6.95pt;width:70.7pt;height:26.9pt;z-index:251601408;visibility:visible;mso-wrap-style:square;mso-width-percent:0;mso-height-percent:0;mso-wrap-distance-left:9pt;mso-wrap-distance-top:0;mso-wrap-distance-right:9pt;mso-wrap-distance-bottom:0;mso-position-horizontal:absolute;mso-position-horizontal-relative:text;mso-position-vertical:absolute;mso-position-vertical-relative:text;mso-width-percent:0;mso-height-percent:0;mso-width-relative:margin;mso-height-relative:margin;v-text-anchor:top" o:gfxdata="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" filled="f" stroked="f">
+              <v:shape w14:anchorId="1BD27A19" id="_x0000_s1036" type="#_x0000_t202" style="position:absolute;margin-left:412.95pt;margin-top:6.95pt;width:70.7pt;height:26.9pt;z-index:251601408;visibility:visible;mso-wrap-style:square;mso-width-percent:0;mso-height-percent:0;mso-wrap-distance-left:9pt;mso-wrap-distance-top:0;mso-wrap-distance-right:9pt;mso-wrap-distance-bottom:0;mso-position-horizontal:absolute;mso-position-horizontal-relative:text;mso-position-vertical:absolute;mso-position-vertical-relative:text;mso-width-percent:0;mso-height-percent:0;mso-width-relative:margin;mso-height-relative:margin;v-text-anchor:top" o:gfxdata="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" filled="f" stroked="f">
                 <v:textbox>
                   <w:txbxContent>
                     <w:p>
@@ -2899,7 +2899,7 @@
           </mc:Choice>
           <mc:Fallback>
             <w:pict>
-              <v:shape w14:anchorId="268BCEE5" id="Cuadro de texto 40" o:spid="_x0000_s1037" type="#_x0000_t202" style="position:absolute;margin-left:515.85pt;margin-top:12.45pt;width:44pt;height:28.15pt;z-index:251605504;visibility:visible;mso-wrap-style:square;mso-width-percent:0;mso-height-percent:0;mso-wrap-distance-left:9pt;mso-wrap-distance-top:3.6pt;mso-wrap-distance-right:9pt;mso-wrap-distance-bottom:3.6pt;mso-position-horizontal:absolute;mso-position-horizontal-relative:left-margin-area;mso-position-vertical:absolute;mso-position-vertical-relative:text;mso-width-percent:0;mso-height-percent:0;mso-width-relative:margin;mso-height-relative:margin;v-text-anchor:top" o:gfxdata="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" filled="f" stroked="f">
+              <v:shape w14:anchorId="268BCEE5" id="Cuadro de texto 40" o:spid="_x0000_s1037" type="#_x0000_t202" style="position:absolute;margin-left:515.85pt;margin-top:12.45pt;width:44pt;height:28.15pt;z-index:251605504;visibility:visible;mso-wrap-style:square;mso-width-percent:0;mso-height-percent:0;mso-wrap-distance-left:9pt;mso-wrap-distance-top:3.6pt;mso-wrap-distance-right:9pt;mso-wrap-distance-bottom:3.6pt;mso-position-horizontal:absolute;mso-position-horizontal-relative:left-margin-area;mso-position-vertical:absolute;mso-position-vertical-relative:text;mso-width-percent:0;mso-height-percent:0;mso-width-relative:margin;mso-height-relative:margin;v-text-anchor:top" o:gfxdata="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" filled="f" stroked="f">
                 <v:textbox>
                   <w:txbxContent>
                     <w:p>
@@ -3036,7 +3036,7 @@
           </mc:Choice>
           <mc:Fallback>
             <w:pict>
-              <v:shape w14:anchorId="47AACCF7" id="_x0000_s1038" type="#_x0000_t202" style="position:absolute;margin-left:274.95pt;margin-top:18.6pt;width:154.35pt;height:24.15pt;z-index:251629056;visibility:visible;mso-wrap-style:square;mso-width-percent:0;mso-wrap-distance-left:9pt;mso-wrap-distance-top:0;mso-wrap-distance-right:9pt;mso-wrap-distance-bottom:0;mso-position-horizontal:absolute;mso-position-horizontal-relative:margin;mso-position-vertical:absolute;mso-position-vertical-relative:text;mso-width-percent:0;mso-width-relative:margin;v-text-anchor:top" o:gfxdata="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" filled="f" stroked="f">
+              <v:shape w14:anchorId="47AACCF7" id="_x0000_s1038" type="#_x0000_t202" style="position:absolute;margin-left:274.95pt;margin-top:18.6pt;width:154.35pt;height:24.15pt;z-index:251629056;visibility:visible;mso-wrap-style:square;mso-width-percent:0;mso-wrap-distance-left:9pt;mso-wrap-distance-top:0;mso-wrap-distance-right:9pt;mso-wrap-distance-bottom:0;mso-position-horizontal:absolute;mso-position-horizontal-relative:margin;mso-position-vertical:absolute;mso-position-vertical-relative:text;mso-width-percent:0;mso-width-relative:margin;v-text-anchor:top" o:gfxdata="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" filled="f" stroked="f">
                 <v:textbox style="mso-fit-shape-to-text:t">
                   <w:txbxContent>
                     <w:p>
@@ -3142,7 +3142,7 @@
           </mc:Choice>
           <mc:Fallback>
             <w:pict>
-              <v:shape w14:anchorId="257683B9" id="_x0000_s1039" type="#_x0000_t202" style="position:absolute;margin-left:324.55pt;margin-top:9.9pt;width:32.3pt;height:24.15pt;z-index:251628032;visibility:visible;mso-wrap-style:square;mso-width-percent:0;mso-wrap-distance-left:9pt;mso-wrap-distance-top:0;mso-wrap-distance-right:9pt;mso-wrap-distance-bottom:0;mso-position-horizontal:absolute;mso-position-horizontal-relative:left-margin-area;mso-position-vertical:absolute;mso-position-vertical-relative:text;mso-width-percent:0;mso-width-relative:margin;v-text-anchor:top" o:gfxdata="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" filled="f" stroked="f">
+              <v:shape w14:anchorId="257683B9" id="_x0000_s1039" type="#_x0000_t202" style="position:absolute;margin-left:324.55pt;margin-top:9.9pt;width:32.3pt;height:24.15pt;z-index:251628032;visibility:visible;mso-wrap-style:square;mso-width-percent:0;mso-wrap-distance-left:9pt;mso-wrap-distance-top:0;mso-wrap-distance-right:9pt;mso-wrap-distance-bottom:0;mso-position-horizontal:absolute;mso-position-horizontal-relative:left-margin-area;mso-position-vertical:absolute;mso-position-vertical-relative:text;mso-width-percent:0;mso-width-relative:margin;v-text-anchor:top" o:gfxdata="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" filled="f" stroked="f">
                 <v:textbox style="mso-fit-shape-to-text:t">
                   <w:txbxContent>
                     <w:p>
@@ -3251,7 +3251,7 @@
               </wp:anchor>
             </w:drawing>
           </mc:Choice>
-          <mc:Fallback>
+          <mc:Fallback xmlns:w16sdtfl="http://schemas.microsoft.com/office/word/2024/wordml/sdtformatlock" xmlns:w16du="http://schemas.microsoft.com/office/word/2023/wordml/word16du" xmlns:oel="http://schemas.microsoft.com/office/2019/extlst">
             <w:pict>
               <v:oval w14:anchorId="7428E582" id="Elipse 224" o:spid="_x0000_s1026" style="position:absolute;margin-left:321.4pt;margin-top:11.25pt;width:41.1pt;height:40.9pt;z-index:251627008;visibility:visible;mso-wrap-style:square;mso-width-percent:0;mso-height-percent:0;mso-wrap-distance-left:9pt;mso-wrap-distance-top:0;mso-wrap-distance-right:9pt;mso-wrap-distance-bottom:0;mso-position-horizontal:absolute;mso-position-horizontal-relative:left-margin-area;mso-position-vertical:absolute;mso-position-vertical-relative:text;mso-width-percent:0;mso-height-percent:0;mso-width-relative:margin;mso-height-relative:margin;v-text-anchor:middle" o:gfxdata="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" fillcolor="#12af9a" strokecolor="white [3212]" strokeweight="1pt">
                 <v:stroke joinstyle="miter"/>
@@ -3387,7 +3387,7 @@
               </wp:anchor>
             </w:drawing>
           </mc:Choice>
-          <mc:Fallback>
+          <mc:Fallback xmlns:w16sdtfl="http://schemas.microsoft.com/office/word/2024/wordml/sdtformatlock" xmlns:w16du="http://schemas.microsoft.com/office/word/2023/wordml/word16du" xmlns:oel="http://schemas.microsoft.com/office/2019/extlst">
             <w:pict>
               <v:group w14:anchorId="28323E71" id="Grupo 220" o:spid="_x0000_s1026" style="position:absolute;margin-left:248.45pt;margin-top:15.2pt;width:186.55pt;height:30.55pt;z-index:251625984" coordsize="23693,3881" o:gfxdata="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">
                 <v:shape id="Terminador 221" o:spid="_x0000_s1027" type="#_x0000_t116" style="position:absolute;left:9703;width:13990;height:3881;visibility:visible;mso-wrap-style:square;v-text-anchor:middle" o:gfxdata="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" filled="f" stroked="f" strokeweight="1pt"/>
@@ -3469,7 +3469,7 @@
           </mc:Choice>
           <mc:Fallback>
             <w:pict>
-              <v:shape w14:anchorId="58AE271A" id="_x0000_s1040" type="#_x0000_t202" style="position:absolute;margin-left:-27.85pt;margin-top:18.45pt;width:94.8pt;height:24.15pt;z-index:251611648;visibility:visible;mso-wrap-style:square;mso-width-percent:0;mso-wrap-distance-left:9pt;mso-wrap-distance-top:0;mso-wrap-distance-right:9pt;mso-wrap-distance-bottom:0;mso-position-horizontal:absolute;mso-position-horizontal-relative:margin;mso-position-vertical:absolute;mso-position-vertical-relative:text;mso-width-percent:0;mso-width-relative:margin;v-text-anchor:top" o:gfxdata="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" filled="f" stroked="f">
+              <v:shape w14:anchorId="58AE271A" id="_x0000_s1040" type="#_x0000_t202" style="position:absolute;margin-left:-27.85pt;margin-top:18.45pt;width:94.8pt;height:24.15pt;z-index:251611648;visibility:visible;mso-wrap-style:square;mso-width-percent:0;mso-wrap-distance-left:9pt;mso-wrap-distance-top:0;mso-wrap-distance-right:9pt;mso-wrap-distance-bottom:0;mso-position-horizontal:absolute;mso-position-horizontal-relative:margin;mso-position-vertical:absolute;mso-position-vertical-relative:text;mso-width-percent:0;mso-width-relative:margin;v-text-anchor:top" o:gfxdata="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" filled="f" stroked="f">
                 <v:textbox style="mso-fit-shape-to-text:t">
                   <w:txbxContent>
                     <w:p>
@@ -3575,7 +3575,7 @@
               </wp:anchor>
             </w:drawing>
           </mc:Choice>
-          <mc:Fallback>
+          <mc:Fallback xmlns:w16sdtfl="http://schemas.microsoft.com/office/word/2024/wordml/sdtformatlock" xmlns:w16du="http://schemas.microsoft.com/office/word/2023/wordml/word16du" xmlns:oel="http://schemas.microsoft.com/office/2019/extlst">
             <w:pict>
               <v:roundrect w14:anchorId="6523FC03" id="Rectángulo redondeado 216" o:spid="_x0000_s1026" style="position:absolute;margin-left:-62.35pt;margin-top:28.25pt;width:264.15pt;height:303.8pt;z-index:-251726336;visibility:visible;mso-wrap-style:square;mso-width-percent:0;mso-height-percent:0;mso-wrap-distance-left:9pt;mso-wrap-distance-top:0;mso-wrap-distance-right:9pt;mso-wrap-distance-bottom:0;mso-position-horizontal:absolute;mso-position-horizontal-relative:text;mso-position-vertical:absolute;mso-position-vertical-relative:text;mso-width-percent:0;mso-height-percent:0;mso-width-relative:margin;mso-height-relative:margin;v-text-anchor:middle" arcsize="10923f" o:gfxdata="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" fillcolor="white [3212]" strokecolor="#eac400" strokeweight="1pt">
                 <v:stroke joinstyle="miter"/>
@@ -3713,7 +3713,7 @@
               </wp:anchor>
             </w:drawing>
           </mc:Choice>
-          <mc:Fallback>
+          <mc:Fallback xmlns:w16sdtfl="http://schemas.microsoft.com/office/word/2024/wordml/sdtformatlock" xmlns:w16du="http://schemas.microsoft.com/office/word/2023/wordml/word16du" xmlns:oel="http://schemas.microsoft.com/office/2019/extlst">
             <w:pict>
               <v:group w14:anchorId="23548652" id="Grupo 196" o:spid="_x0000_s1026" style="position:absolute;margin-left:-46.05pt;margin-top:15.1pt;width:192.35pt;height:30.55pt;z-index:251609600;mso-width-relative:margin" coordsize="23693,3881" o:gfxdata="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">
                 <v:shape id="Terminador 197" o:spid="_x0000_s1027" type="#_x0000_t116" style="position:absolute;left:9703;width:13990;height:3881;visibility:visible;mso-wrap-style:square;v-text-anchor:middle" o:gfxdata="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" filled="f" stroked="f" strokeweight="1pt"/>
@@ -3798,7 +3798,7 @@
           </mc:Choice>
           <mc:Fallback>
             <w:pict>
-              <v:shape w14:anchorId="72F83C66" id="_x0000_s1041" type="#_x0000_t202" style="position:absolute;margin-left:26.2pt;margin-top:8.95pt;width:32.3pt;height:24.15pt;z-index:251612672;visibility:visible;mso-wrap-style:square;mso-width-percent:0;mso-wrap-distance-left:9pt;mso-wrap-distance-top:0;mso-wrap-distance-right:9pt;mso-wrap-distance-bottom:0;mso-position-horizontal:absolute;mso-position-horizontal-relative:left-margin-area;mso-position-vertical:absolute;mso-position-vertical-relative:text;mso-width-percent:0;mso-width-relative:margin;v-text-anchor:top" o:gfxdata="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" filled="f" stroked="f">
+              <v:shape w14:anchorId="72F83C66" id="_x0000_s1041" type="#_x0000_t202" style="position:absolute;margin-left:26.2pt;margin-top:8.95pt;width:32.3pt;height:24.15pt;z-index:251612672;visibility:visible;mso-wrap-style:square;mso-width-percent:0;mso-wrap-distance-left:9pt;mso-wrap-distance-top:0;mso-wrap-distance-right:9pt;mso-wrap-distance-bottom:0;mso-position-horizontal:absolute;mso-position-horizontal-relative:left-margin-area;mso-position-vertical:absolute;mso-position-vertical-relative:text;mso-width-percent:0;mso-width-relative:margin;v-text-anchor:top" o:gfxdata="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" filled="f" stroked="f">
                 <v:textbox style="mso-fit-shape-to-text:t">
                   <w:txbxContent>
                     <w:p>
@@ -3907,7 +3907,7 @@
               </wp:anchor>
             </w:drawing>
           </mc:Choice>
-          <mc:Fallback>
+          <mc:Fallback xmlns:w16sdtfl="http://schemas.microsoft.com/office/word/2024/wordml/sdtformatlock" xmlns:w16du="http://schemas.microsoft.com/office/word/2023/wordml/word16du" xmlns:oel="http://schemas.microsoft.com/office/2019/extlst">
             <w:pict>
               <v:oval w14:anchorId="0D498936" id="Elipse 199" o:spid="_x0000_s1026" style="position:absolute;margin-left:21.3pt;margin-top:10.2pt;width:41.1pt;height:40.9pt;z-index:251610624;visibility:visible;mso-wrap-style:square;mso-width-percent:0;mso-height-percent:0;mso-wrap-distance-left:9pt;mso-wrap-distance-top:0;mso-wrap-distance-right:9pt;mso-wrap-distance-bottom:0;mso-position-horizontal:absolute;mso-position-horizontal-relative:left-margin-area;mso-position-vertical:absolute;mso-position-vertical-relative:text;mso-width-percent:0;mso-height-percent:0;mso-width-relative:margin;mso-height-relative:margin;v-text-anchor:middle" o:gfxdata="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" fillcolor="#ffc000" strokecolor="white [3212]" strokeweight="1pt">
                 <v:stroke joinstyle="miter"/>
@@ -3999,7 +3999,7 @@
               </wp:anchor>
             </w:drawing>
           </mc:Choice>
-          <mc:Fallback>
+          <mc:Fallback xmlns:w16sdtfl="http://schemas.microsoft.com/office/word/2024/wordml/sdtformatlock" xmlns:w16du="http://schemas.microsoft.com/office/word/2023/wordml/word16du" xmlns:oel="http://schemas.microsoft.com/office/2019/extlst">
             <w:pict>
               <v:roundrect w14:anchorId="4E5DAF20" id="Rectángulo redondeado 240" o:spid="_x0000_s1026" style="position:absolute;margin-left:233pt;margin-top:8.05pt;width:261.1pt;height:301.1pt;z-index:-251681280;visibility:visible;mso-wrap-style:square;mso-width-percent:0;mso-height-percent:0;mso-wrap-distance-left:9pt;mso-wrap-distance-top:0;mso-wrap-distance-right:9pt;mso-wrap-distance-bottom:0;mso-position-horizontal:absolute;mso-position-horizontal-relative:margin;mso-position-vertical:absolute;mso-position-vertical-relative:text;mso-width-percent:0;mso-height-percent:0;mso-width-relative:margin;mso-height-relative:margin;v-text-anchor:middle" arcsize="10923f" o:gfxdata="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" fillcolor="white [3212]" strokecolor="#12af9a" strokeweight="1pt">
                 <v:stroke joinstyle="miter"/>
@@ -5530,7 +5530,7 @@
           </mc:Choice>
           <mc:Fallback>
             <w:pict>
-              <v:group w14:anchorId="51EAA00F" id="Grupo 401" o:spid="_x0000_s1042" style="position:absolute;margin-left:372.75pt;margin-top:16.8pt;width:73.2pt;height:238.6pt;z-index:251681280;mso-width-relative:margin" coordsize="9298,30302" o:gfxdata="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">
+              <v:group w14:anchorId="51EAA00F" id="Grupo 401" o:spid="_x0000_s1042" style="position:absolute;margin-left:372.75pt;margin-top:16.8pt;width:73.2pt;height:238.6pt;z-index:251681280;mso-width-relative:margin" coordsize="9298,30302" o:gfxdata="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">
                 <v:group id="Grupo 402" o:spid="_x0000_s1043" style="position:absolute;width:9245;height:4749" coordsize="10871,5588" o:gfxdata="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">
                   <v:roundrect id="Rectángulo: esquinas redondeadas 403" o:spid="_x0000_s1044" style="position:absolute;top:508;width:8229;height:4572;visibility:visible;mso-wrap-style:square;v-text-anchor:middle" arcsize="15161f" o:gfxdata="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" fillcolor="white [3201]" strokecolor="#1995c2" strokeweight="1pt">
                     <v:stroke joinstyle="miter"/>
@@ -7761,7 +7761,7 @@
           </mc:Choice>
           <mc:Fallback>
             <w:pict>
-              <v:group w14:anchorId="4EE7A98F" id="Grupo 400" o:spid="_x0000_s1073" style="position:absolute;margin-left:276.2pt;margin-top:16.8pt;width:73.65pt;height:238.6pt;z-index:251680256;mso-width-relative:margin" coordsize="9355,30302" o:gfxdata="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">
+              <v:group w14:anchorId="4EE7A98F" id="Grupo 400" o:spid="_x0000_s1073" style="position:absolute;margin-left:276.2pt;margin-top:16.8pt;width:73.65pt;height:238.6pt;z-index:251680256;mso-width-relative:margin" coordsize="9355,30302" o:gfxdata="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">
                 <v:group id="Grupo 285" o:spid="_x0000_s1074" style="position:absolute;width:9245;height:4749" coordsize="10871,5588" o:gfxdata="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">
                   <v:roundrect id="Rectángulo: esquinas redondeadas 277" o:spid="_x0000_s1075" style="position:absolute;top:508;width:8229;height:4572;visibility:visible;mso-wrap-style:square;v-text-anchor:middle" arcsize="15161f" o:gfxdata="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" fillcolor="white [3201]" strokecolor="#8dd117" strokeweight="1pt">
                     <v:stroke joinstyle="miter"/>
@@ -8564,7 +8564,7 @@
           </mc:Choice>
           <mc:Fallback>
             <w:pict>
-              <v:shape w14:anchorId="1F93DDA4" id="_x0000_s1104" type="#_x0000_t202" style="position:absolute;margin-left:-37.85pt;margin-top:-.15pt;width:248.1pt;height:46.3pt;z-index:251623936;visibility:visible;mso-wrap-style:square;mso-width-percent:0;mso-height-percent:0;mso-wrap-distance-left:9pt;mso-wrap-distance-top:3.6pt;mso-wrap-distance-right:9pt;mso-wrap-distance-bottom:3.6pt;mso-position-horizontal:absolute;mso-position-horizontal-relative:text;mso-position-vertical:absolute;mso-position-vertical-relative:text;mso-width-percent:0;mso-height-percent:0;mso-width-relative:margin;mso-height-relative:margin;v-text-anchor:top" o:gfxdata="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" filled="f" stroked="f">
+              <v:shape w14:anchorId="1F93DDA4" id="_x0000_s1104" type="#_x0000_t202" style="position:absolute;margin-left:-37.85pt;margin-top:-.15pt;width:248.1pt;height:46.3pt;z-index:251623936;visibility:visible;mso-wrap-style:square;mso-width-percent:0;mso-height-percent:0;mso-wrap-distance-left:9pt;mso-wrap-distance-top:3.6pt;mso-wrap-distance-right:9pt;mso-wrap-distance-bottom:3.6pt;mso-position-horizontal:absolute;mso-position-horizontal-relative:text;mso-position-vertical:absolute;mso-position-vertical-relative:text;mso-width-percent:0;mso-height-percent:0;mso-width-relative:margin;mso-height-relative:margin;v-text-anchor:top" o:gfxdata="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" filled="f" stroked="f">
                 <v:textbox>
                   <w:txbxContent>
                     <w:p>
@@ -8818,7 +8818,7 @@
               </wp:anchor>
             </w:drawing>
           </mc:Choice>
-          <mc:Fallback>
+          <mc:Fallback xmlns:w16sdtfl="http://schemas.microsoft.com/office/word/2024/wordml/sdtformatlock" xmlns:w16du="http://schemas.microsoft.com/office/word/2023/wordml/word16du" xmlns:oel="http://schemas.microsoft.com/office/2019/extlst">
             <w:pict>
               <v:group w14:anchorId="72F9690E" id="Grupo 251" o:spid="_x0000_s1026" style="position:absolute;margin-left:-23.5pt;margin-top:25.4pt;width:192.85pt;height:228.15pt;z-index:251608576;mso-width-relative:margin;mso-height-relative:margin" coordsize="24490,28977" o:gfxdata="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">
                 <v:shape id="Picture 8" o:spid="_x0000_s1027" type="#_x0000_t75" alt="13-01" style="position:absolute;left:454;top:16071;width:11024;height:11931;rotation:-8221951fd;visibility:visible;mso-wrap-style:square" o:gfxdata="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">
@@ -8940,7 +8940,7 @@
           </mc:Choice>
           <mc:Fallback>
             <w:pict>
-              <v:shape w14:anchorId="554A0536" id="Cuadro de texto 208" o:spid="_x0000_s1105" type="#_x0000_t202" style="position:absolute;margin-left:169.35pt;margin-top:8.35pt;width:44pt;height:28.15pt;z-index:251619840;visibility:visible;mso-wrap-style:square;mso-width-percent:0;mso-height-percent:0;mso-wrap-distance-left:9pt;mso-wrap-distance-top:3.6pt;mso-wrap-distance-right:9pt;mso-wrap-distance-bottom:3.6pt;mso-position-horizontal:absolute;mso-position-horizontal-relative:left-margin-area;mso-position-vertical:absolute;mso-position-vertical-relative:text;mso-width-percent:0;mso-height-percent:0;mso-width-relative:margin;mso-height-relative:margin;v-text-anchor:top" o:gfxdata="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" filled="f" stroked="f">
+              <v:shape w14:anchorId="554A0536" id="Cuadro de texto 208" o:spid="_x0000_s1105" type="#_x0000_t202" style="position:absolute;margin-left:169.35pt;margin-top:8.35pt;width:44pt;height:28.15pt;z-index:251619840;visibility:visible;mso-wrap-style:square;mso-width-percent:0;mso-height-percent:0;mso-wrap-distance-left:9pt;mso-wrap-distance-top:3.6pt;mso-wrap-distance-right:9pt;mso-wrap-distance-bottom:3.6pt;mso-position-horizontal:absolute;mso-position-horizontal-relative:left-margin-area;mso-position-vertical:absolute;mso-position-vertical-relative:text;mso-width-percent:0;mso-height-percent:0;mso-width-relative:margin;mso-height-relative:margin;v-text-anchor:top" o:gfxdata="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" filled="f" stroked="f">
                 <v:textbox>
                   <w:txbxContent>
                     <w:p>
@@ -9055,7 +9055,7 @@
               </wp:anchor>
             </w:drawing>
           </mc:Choice>
-          <mc:Fallback>
+          <mc:Fallback xmlns:w16sdtfl="http://schemas.microsoft.com/office/word/2024/wordml/sdtformatlock" xmlns:w16du="http://schemas.microsoft.com/office/word/2023/wordml/word16du" xmlns:oel="http://schemas.microsoft.com/office/2019/extlst">
             <w:pict>
               <v:shapetype w14:anchorId="744AE9ED" id="_x0000_t102" coordsize="21600,21600" o:spt="102" adj="12960,19440,14400" path="ar,0@23@3@22,,0@4,0@15@23@1,0@7@2@13l@2@14@22@8@2@12wa,0@23@3@2@11@26@17,0@15@23@1@26@17@22@15xear,0@23@3,0@4@26@17nfe">
                 <v:stroke joinstyle="miter"/>
@@ -9307,7 +9307,7 @@
               </wp:anchor>
             </w:drawing>
           </mc:Choice>
-          <mc:Fallback>
+          <mc:Fallback xmlns:w16sdtfl="http://schemas.microsoft.com/office/word/2024/wordml/sdtformatlock" xmlns:w16du="http://schemas.microsoft.com/office/word/2023/wordml/word16du" xmlns:oel="http://schemas.microsoft.com/office/2019/extlst">
             <w:pict>
               <v:group w14:anchorId="5A8F2B5D" id="Grupo 299" o:spid="_x0000_s1026" style="position:absolute;margin-left:28.25pt;margin-top:15.05pt;width:54pt;height:55.35pt;z-index:251588096" coordsize="6858,7027" o:gfxdata="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">
                 <v:oval id="Elipse 24" o:spid="_x0000_s1027" style="position:absolute;width:6858;height:7027;visibility:visible;mso-wrap-style:square;v-text-anchor:middle" o:gfxdata="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" fillcolor="#00b0f0" strokecolor="white [3212]" strokeweight="1pt">
@@ -9413,7 +9413,7 @@
           </mc:Choice>
           <mc:Fallback>
             <w:pict>
-              <v:shape w14:anchorId="0CB40B84" id="Cuadro de texto 219" o:spid="_x0000_s1106" type="#_x0000_t202" style="position:absolute;margin-left:215.85pt;margin-top:3.75pt;width:44pt;height:28.15pt;z-index:251624960;visibility:visible;mso-wrap-style:square;mso-width-percent:0;mso-height-percent:0;mso-wrap-distance-left:9pt;mso-wrap-distance-top:3.6pt;mso-wrap-distance-right:9pt;mso-wrap-distance-bottom:3.6pt;mso-position-horizontal:absolute;mso-position-horizontal-relative:left-margin-area;mso-position-vertical:absolute;mso-position-vertical-relative:text;mso-width-percent:0;mso-height-percent:0;mso-width-relative:margin;mso-height-relative:margin;v-text-anchor:top" o:gfxdata="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" filled="f" stroked="f">
+              <v:shape w14:anchorId="0CB40B84" id="Cuadro de texto 219" o:spid="_x0000_s1106" type="#_x0000_t202" style="position:absolute;margin-left:215.85pt;margin-top:3.75pt;width:44pt;height:28.15pt;z-index:251624960;visibility:visible;mso-wrap-style:square;mso-width-percent:0;mso-height-percent:0;mso-wrap-distance-left:9pt;mso-wrap-distance-top:3.6pt;mso-wrap-distance-right:9pt;mso-wrap-distance-bottom:3.6pt;mso-position-horizontal:absolute;mso-position-horizontal-relative:left-margin-area;mso-position-vertical:absolute;mso-position-vertical-relative:text;mso-width-percent:0;mso-height-percent:0;mso-width-relative:margin;mso-height-relative:margin;v-text-anchor:top" o:gfxdata="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" filled="f" stroked="f">
                 <v:textbox>
                   <w:txbxContent>
                     <w:p>
@@ -9581,7 +9581,7 @@
           </mc:Choice>
           <mc:Fallback>
             <w:pict>
-              <v:shape w14:anchorId="6F109D9A" id="Cuadro de texto 204" o:spid="_x0000_s1107" type="#_x0000_t202" style="position:absolute;margin-left:24.7pt;margin-top:5.65pt;width:60.2pt;height:36pt;z-index:251613696;visibility:visible;mso-wrap-style:square;mso-width-percent:0;mso-height-percent:0;mso-wrap-distance-left:9pt;mso-wrap-distance-top:3.6pt;mso-wrap-distance-right:9pt;mso-wrap-distance-bottom:3.6pt;mso-position-horizontal:absolute;mso-position-horizontal-relative:margin;mso-position-vertical:absolute;mso-position-vertical-relative:text;mso-width-percent:0;mso-height-percent:0;mso-width-relative:margin;mso-height-relative:margin;v-text-anchor:top" o:gfxdata="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" filled="f" stroked="f">
+              <v:shape w14:anchorId="6F109D9A" id="Cuadro de texto 204" o:spid="_x0000_s1107" type="#_x0000_t202" style="position:absolute;margin-left:24.7pt;margin-top:5.65pt;width:60.2pt;height:36pt;z-index:251613696;visibility:visible;mso-wrap-style:square;mso-width-percent:0;mso-height-percent:0;mso-wrap-distance-left:9pt;mso-wrap-distance-top:3.6pt;mso-wrap-distance-right:9pt;mso-wrap-distance-bottom:3.6pt;mso-position-horizontal:absolute;mso-position-horizontal-relative:margin;mso-position-vertical:absolute;mso-position-vertical-relative:text;mso-width-percent:0;mso-height-percent:0;mso-width-relative:margin;mso-height-relative:margin;v-text-anchor:top" o:gfxdata="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" filled="f" stroked="f">
                 <v:textbox>
                   <w:txbxContent>
                     <w:p>
@@ -9748,7 +9748,7 @@
           </mc:Choice>
           <mc:Fallback>
             <w:pict>
-              <v:shape w14:anchorId="7A10F021" id="Cuadro de texto 238" o:spid="_x0000_s1108" type="#_x0000_t202" style="position:absolute;margin-left:288.15pt;margin-top:9.65pt;width:81.9pt;height:36.5pt;z-index:251633152;visibility:visible;mso-wrap-style:square;mso-width-percent:0;mso-height-percent:0;mso-wrap-distance-left:9pt;mso-wrap-distance-top:3.6pt;mso-wrap-distance-right:9pt;mso-wrap-distance-bottom:3.6pt;mso-position-horizontal:absolute;mso-position-horizontal-relative:margin;mso-position-vertical:absolute;mso-position-vertical-relative:text;mso-width-percent:0;mso-height-percent:0;mso-width-relative:margin;mso-height-relative:margin;v-text-anchor:top" o:gfxdata="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" filled="f" stroked="f">
+              <v:shape w14:anchorId="7A10F021" id="Cuadro de texto 238" o:spid="_x0000_s1108" type="#_x0000_t202" style="position:absolute;margin-left:288.15pt;margin-top:9.65pt;width:81.9pt;height:36.5pt;z-index:251633152;visibility:visible;mso-wrap-style:square;mso-width-percent:0;mso-height-percent:0;mso-wrap-distance-left:9pt;mso-wrap-distance-top:3.6pt;mso-wrap-distance-right:9pt;mso-wrap-distance-bottom:3.6pt;mso-position-horizontal:absolute;mso-position-horizontal-relative:margin;mso-position-vertical:absolute;mso-position-vertical-relative:text;mso-width-percent:0;mso-height-percent:0;mso-width-relative:margin;mso-height-relative:margin;v-text-anchor:top" o:gfxdata="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" filled="f" stroked="f">
                 <v:textbox>
                   <w:txbxContent>
                     <w:p>
@@ -9928,7 +9928,7 @@
           </mc:Choice>
           <mc:Fallback>
             <w:pict>
-              <v:shape w14:anchorId="0224E29A" id="Cuadro de texto 210" o:spid="_x0000_s1109" type="#_x0000_t202" style="position:absolute;margin-left:204.35pt;margin-top:16.45pt;width:44pt;height:28.15pt;z-index:251620864;visibility:visible;mso-wrap-style:square;mso-width-percent:0;mso-height-percent:0;mso-wrap-distance-left:9pt;mso-wrap-distance-top:3.6pt;mso-wrap-distance-right:9pt;mso-wrap-distance-bottom:3.6pt;mso-position-horizontal:absolute;mso-position-horizontal-relative:left-margin-area;mso-position-vertical:absolute;mso-position-vertical-relative:text;mso-width-percent:0;mso-height-percent:0;mso-width-relative:margin;mso-height-relative:margin;v-text-anchor:top" o:gfxdata="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" filled="f" stroked="f">
+              <v:shape w14:anchorId="0224E29A" id="Cuadro de texto 210" o:spid="_x0000_s1109" type="#_x0000_t202" style="position:absolute;margin-left:204.35pt;margin-top:16.45pt;width:44pt;height:28.15pt;z-index:251620864;visibility:visible;mso-wrap-style:square;mso-width-percent:0;mso-height-percent:0;mso-wrap-distance-left:9pt;mso-wrap-distance-top:3.6pt;mso-wrap-distance-right:9pt;mso-wrap-distance-bottom:3.6pt;mso-position-horizontal:absolute;mso-position-horizontal-relative:left-margin-area;mso-position-vertical:absolute;mso-position-vertical-relative:text;mso-width-percent:0;mso-height-percent:0;mso-width-relative:margin;mso-height-relative:margin;v-text-anchor:top" o:gfxdata="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" filled="f" stroked="f">
                 <v:textbox>
                   <w:txbxContent>
                     <w:p>
@@ -10050,7 +10050,7 @@
           </mc:Choice>
           <mc:Fallback>
             <w:pict>
-              <v:shape w14:anchorId="20002AA3" id="Cuadro de texto 239" o:spid="_x0000_s1110" type="#_x0000_t202" style="position:absolute;margin-left:402.75pt;margin-top:37pt;width:81.9pt;height:36.5pt;z-index:251634176;visibility:visible;mso-wrap-style:square;mso-width-percent:0;mso-height-percent:0;mso-wrap-distance-left:9pt;mso-wrap-distance-top:3.6pt;mso-wrap-distance-right:9pt;mso-wrap-distance-bottom:3.6pt;mso-position-horizontal:absolute;mso-position-horizontal-relative:margin;mso-position-vertical:absolute;mso-position-vertical-relative:text;mso-width-percent:0;mso-height-percent:0;mso-width-relative:margin;mso-height-relative:margin;v-text-anchor:top" o:gfxdata="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" filled="f" stroked="f">
+              <v:shape w14:anchorId="20002AA3" id="Cuadro de texto 239" o:spid="_x0000_s1110" type="#_x0000_t202" style="position:absolute;margin-left:402.75pt;margin-top:37pt;width:81.9pt;height:36.5pt;z-index:251634176;visibility:visible;mso-wrap-style:square;mso-width-percent:0;mso-height-percent:0;mso-wrap-distance-left:9pt;mso-wrap-distance-top:3.6pt;mso-wrap-distance-right:9pt;mso-wrap-distance-bottom:3.6pt;mso-position-horizontal:absolute;mso-position-horizontal-relative:margin;mso-position-vertical:absolute;mso-position-vertical-relative:text;mso-width-percent:0;mso-height-percent:0;mso-width-relative:margin;mso-height-relative:margin;v-text-anchor:top" o:gfxdata="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" filled="f" stroked="f">
                 <v:textbox>
                   <w:txbxContent>
                     <w:p>
@@ -10232,7 +10232,7 @@
           </mc:Choice>
           <mc:Fallback>
             <w:pict>
-              <v:shape w14:anchorId="69E9C629" id="Cuadro de texto 212" o:spid="_x0000_s1111" type="#_x0000_t202" style="position:absolute;margin-left:-22.05pt;margin-top:6.85pt;width:44pt;height:28.15pt;z-index:251622912;visibility:visible;mso-wrap-style:square;mso-width-percent:0;mso-height-percent:0;mso-wrap-distance-left:9pt;mso-wrap-distance-top:3.6pt;mso-wrap-distance-right:9pt;mso-wrap-distance-bottom:3.6pt;mso-position-horizontal:absolute;mso-position-horizontal-relative:margin;mso-position-vertical:absolute;mso-position-vertical-relative:text;mso-width-percent:0;mso-height-percent:0;mso-width-relative:margin;mso-height-relative:margin;v-text-anchor:top" o:gfxdata="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" filled="f" stroked="f">
+              <v:shape w14:anchorId="69E9C629" id="Cuadro de texto 212" o:spid="_x0000_s1111" type="#_x0000_t202" style="position:absolute;margin-left:-22.05pt;margin-top:6.85pt;width:44pt;height:28.15pt;z-index:251622912;visibility:visible;mso-wrap-style:square;mso-width-percent:0;mso-height-percent:0;mso-wrap-distance-left:9pt;mso-wrap-distance-top:3.6pt;mso-wrap-distance-right:9pt;mso-wrap-distance-bottom:3.6pt;mso-position-horizontal:absolute;mso-position-horizontal-relative:margin;mso-position-vertical:absolute;mso-position-vertical-relative:text;mso-width-percent:0;mso-height-percent:0;mso-width-relative:margin;mso-height-relative:margin;v-text-anchor:top" o:gfxdata="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" filled="f" stroked="f">
                 <v:textbox>
                   <w:txbxContent>
                     <w:p>
@@ -10355,7 +10355,7 @@
           </mc:Choice>
           <mc:Fallback>
             <w:pict>
-              <v:shape w14:anchorId="414922BF" id="Cuadro de texto 211" o:spid="_x0000_s1112" type="#_x0000_t202" style="position:absolute;margin-left:140.9pt;margin-top:18.15pt;width:44pt;height:28.15pt;z-index:251621888;visibility:visible;mso-wrap-style:square;mso-width-percent:0;mso-height-percent:0;mso-wrap-distance-left:9pt;mso-wrap-distance-top:3.6pt;mso-wrap-distance-right:9pt;mso-wrap-distance-bottom:3.6pt;mso-position-horizontal:absolute;mso-position-horizontal-relative:left-margin-area;mso-position-vertical:absolute;mso-position-vertical-relative:text;mso-width-percent:0;mso-height-percent:0;mso-width-relative:margin;mso-height-relative:margin;v-text-anchor:top" o:gfxdata="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" filled="f" stroked="f">
+              <v:shape w14:anchorId="414922BF" id="Cuadro de texto 211" o:spid="_x0000_s1112" type="#_x0000_t202" style="position:absolute;margin-left:140.9pt;margin-top:18.15pt;width:44pt;height:28.15pt;z-index:251621888;visibility:visible;mso-wrap-style:square;mso-width-percent:0;mso-height-percent:0;mso-wrap-distance-left:9pt;mso-wrap-distance-top:3.6pt;mso-wrap-distance-right:9pt;mso-wrap-distance-bottom:3.6pt;mso-position-horizontal:absolute;mso-position-horizontal-relative:left-margin-area;mso-position-vertical:absolute;mso-position-vertical-relative:text;mso-width-percent:0;mso-height-percent:0;mso-width-relative:margin;mso-height-relative:margin;v-text-anchor:top" o:gfxdata="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" filled="f" stroked="f">
                 <v:textbox>
                   <w:txbxContent>
                     <w:p>
@@ -10683,7 +10683,7 @@
               </wp:anchor>
             </w:drawing>
           </mc:Choice>
-          <mc:Fallback>
+          <mc:Fallback xmlns:w16sdtfl="http://schemas.microsoft.com/office/word/2024/wordml/sdtformatlock" xmlns:w16du="http://schemas.microsoft.com/office/word/2023/wordml/word16du" xmlns:oel="http://schemas.microsoft.com/office/2019/extlst">
             <w:pict>
               <v:group w14:anchorId="3B153375" id="Grupo 235" o:spid="_x0000_s1026" style="position:absolute;margin-left:-49pt;margin-top:25.8pt;width:255.65pt;height:30.55pt;z-index:251630080" coordsize="32465,3879" o:gfxdata="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">
                 <v:group id="Grupo 226" o:spid="_x0000_s1027" style="position:absolute;width:23691;height:3879" coordsize="23693,3881" o:gfxdata="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">
@@ -10774,7 +10774,7 @@
           </mc:Choice>
           <mc:Fallback>
             <w:pict>
-              <v:shape w14:anchorId="4D560AFE" id="_x0000_s1113" type="#_x0000_t202" style="position:absolute;margin-left:26.9pt;margin-top:18.9pt;width:32.3pt;height:24.15pt;z-index:251632128;visibility:visible;mso-wrap-style:square;mso-width-percent:0;mso-wrap-distance-left:9pt;mso-wrap-distance-top:0;mso-wrap-distance-right:9pt;mso-wrap-distance-bottom:0;mso-position-horizontal:absolute;mso-position-horizontal-relative:left-margin-area;mso-position-vertical:absolute;mso-position-vertical-relative:text;mso-width-percent:0;mso-width-relative:margin;v-text-anchor:top" o:gfxdata="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" filled="f" stroked="f">
+              <v:shape w14:anchorId="4D560AFE" id="_x0000_s1113" type="#_x0000_t202" style="position:absolute;margin-left:26.9pt;margin-top:18.9pt;width:32.3pt;height:24.15pt;z-index:251632128;visibility:visible;mso-wrap-style:square;mso-width-percent:0;mso-wrap-distance-left:9pt;mso-wrap-distance-top:0;mso-wrap-distance-right:9pt;mso-wrap-distance-bottom:0;mso-position-horizontal:absolute;mso-position-horizontal-relative:left-margin-area;mso-position-vertical:absolute;mso-position-vertical-relative:text;mso-width-percent:0;mso-width-relative:margin;v-text-anchor:top" o:gfxdata="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" filled="f" stroked="f">
                 <v:textbox style="mso-fit-shape-to-text:t">
                   <w:txbxContent>
                     <w:p>
@@ -10883,7 +10883,7 @@
               </wp:anchor>
             </w:drawing>
           </mc:Choice>
-          <mc:Fallback>
+          <mc:Fallback xmlns:w16sdtfl="http://schemas.microsoft.com/office/word/2024/wordml/sdtformatlock" xmlns:w16du="http://schemas.microsoft.com/office/word/2023/wordml/word16du" xmlns:oel="http://schemas.microsoft.com/office/2019/extlst">
             <w:pict>
               <v:oval w14:anchorId="589F66DE" id="Elipse 230" o:spid="_x0000_s1026" style="position:absolute;margin-left:-62.75pt;margin-top:19.5pt;width:41.1pt;height:40.9pt;z-index:251631104;visibility:visible;mso-wrap-style:square;mso-width-percent:0;mso-height-percent:0;mso-wrap-distance-left:9pt;mso-wrap-distance-top:0;mso-wrap-distance-right:9pt;mso-wrap-distance-bottom:0;mso-position-horizontal:absolute;mso-position-horizontal-relative:margin;mso-position-vertical:absolute;mso-position-vertical-relative:text;mso-width-percent:0;mso-height-percent:0;mso-width-relative:margin;mso-height-relative:margin;v-text-anchor:middle" o:gfxdata="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" fillcolor="#a3389e" strokecolor="white [3212]" strokeweight="1pt">
                 <v:stroke joinstyle="miter"/>
@@ -10970,7 +10970,7 @@
               </wp:anchor>
             </w:drawing>
           </mc:Choice>
-          <mc:Fallback>
+          <mc:Fallback xmlns:w16sdtfl="http://schemas.microsoft.com/office/word/2024/wordml/sdtformatlock" xmlns:w16du="http://schemas.microsoft.com/office/word/2023/wordml/word16du" xmlns:oel="http://schemas.microsoft.com/office/2019/extlst">
             <w:pict>
               <v:roundrect w14:anchorId="557B7183" id="Rectángulo redondeado 262" o:spid="_x0000_s1026" style="position:absolute;margin-left:-62.9pt;margin-top:17.4pt;width:556.6pt;height:183.65pt;z-index:-251727360;visibility:visible;mso-wrap-style:square;mso-width-percent:0;mso-height-percent:0;mso-wrap-distance-left:9pt;mso-wrap-distance-top:0;mso-wrap-distance-right:9pt;mso-wrap-distance-bottom:0;mso-position-horizontal:absolute;mso-position-horizontal-relative:margin;mso-position-vertical:absolute;mso-position-vertical-relative:text;mso-width-percent:0;mso-height-percent:0;mso-width-relative:margin;mso-height-relative:margin;v-text-anchor:middle" arcsize="10923f" o:gfxdata="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" fillcolor="white [3212]" strokecolor="#a3389e" strokeweight="1pt">
                 <v:stroke joinstyle="miter"/>
@@ -11162,7 +11162,7 @@
               </wp:anchor>
             </w:drawing>
           </mc:Choice>
-          <mc:Fallback>
+          <mc:Fallback xmlns:w16sdtfl="http://schemas.microsoft.com/office/word/2024/wordml/sdtformatlock" xmlns:w16du="http://schemas.microsoft.com/office/word/2023/wordml/word16du" xmlns:oel="http://schemas.microsoft.com/office/2019/extlst">
             <w:pict>
               <v:group w14:anchorId="611DD569" id="Grupo 217" o:spid="_x0000_s1026" style="position:absolute;margin-left:233.3pt;margin-top:3.35pt;width:186.5pt;height:30.55pt;z-index:251659776;mso-position-horizontal-relative:margin;mso-width-relative:margin" coordsize="23691,3879" o:gfxdata="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">
                 <v:group id="Grupo 256" o:spid="_x0000_s1027" style="position:absolute;width:23691;height:3879" coordsize="23693,3881" o:gfxdata="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">
@@ -11414,7 +11414,7 @@
               </wp:anchor>
             </w:drawing>
           </mc:Choice>
-          <mc:Fallback>
+          <mc:Fallback xmlns:w16sdtfl="http://schemas.microsoft.com/office/word/2024/wordml/sdtformatlock" xmlns:w16du="http://schemas.microsoft.com/office/word/2023/wordml/word16du" xmlns:oel="http://schemas.microsoft.com/office/2019/extlst">
             <w:pict>
               <v:group w14:anchorId="3719A570" id="Grupo 254" o:spid="_x0000_s1026" style="position:absolute;margin-left:162.95pt;margin-top:3.35pt;width:255.6pt;height:30.55pt;z-index:251658752;mso-position-horizontal-relative:margin" coordsize="32465,3879" o:gfxdata="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">
                 <v:group id="Grupo 255" o:spid="_x0000_s1027" style="position:absolute;width:23691;height:3879" coordsize="23693,3881" o:gfxdata="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">
@@ -11503,7 +11503,7 @@
           </mc:Choice>
           <mc:Fallback>
             <w:pict>
-              <v:shape w14:anchorId="0A15EF39" id="_x0000_s1114" type="#_x0000_t202" style="position:absolute;margin-left:-25.25pt;margin-top:6.3pt;width:223.45pt;height:24.15pt;z-index:251662848;visibility:visible;mso-wrap-style:square;mso-width-percent:0;mso-wrap-distance-left:9pt;mso-wrap-distance-top:0;mso-wrap-distance-right:9pt;mso-wrap-distance-bottom:0;mso-position-horizontal:absolute;mso-position-horizontal-relative:margin;mso-position-vertical:absolute;mso-position-vertical-relative:text;mso-width-percent:0;mso-width-relative:margin;v-text-anchor:top" o:gfxdata="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" filled="f" stroked="f">
+              <v:shape w14:anchorId="0A15EF39" id="_x0000_s1114" type="#_x0000_t202" style="position:absolute;margin-left:-25.25pt;margin-top:6.3pt;width:223.45pt;height:24.15pt;z-index:251662848;visibility:visible;mso-wrap-style:square;mso-width-percent:0;mso-wrap-distance-left:9pt;mso-wrap-distance-top:0;mso-wrap-distance-right:9pt;mso-wrap-distance-bottom:0;mso-position-horizontal:absolute;mso-position-horizontal-relative:margin;mso-position-vertical:absolute;mso-position-vertical-relative:text;mso-width-percent:0;mso-width-relative:margin;v-text-anchor:top" o:gfxdata="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" filled="f" stroked="f">
                 <v:textbox style="mso-fit-shape-to-text:t">
                   <w:txbxContent>
                     <w:p>
@@ -11735,7 +11735,7 @@
           </mc:Choice>
           <mc:Fallback>
             <w:pict>
-              <v:shape w14:anchorId="036D29D9" id="Cuadro de texto 436" o:spid="_x0000_s1115" type="#_x0000_t202" style="position:absolute;margin-left:-47.85pt;margin-top:13.2pt;width:54.2pt;height:28.15pt;z-index:251686400;visibility:visible;mso-wrap-style:square;mso-wrap-distance-left:9pt;mso-wrap-distance-top:0;mso-wrap-distance-right:9pt;mso-wrap-distance-bottom:0;mso-position-horizontal:absolute;mso-position-horizontal-relative:text;mso-position-vertical:absolute;mso-position-vertical-relative:text;v-text-anchor:top" o:gfxdata="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" filled="f" stroked="f">
+              <v:shape w14:anchorId="036D29D9" id="Cuadro de texto 436" o:spid="_x0000_s1115" type="#_x0000_t202" style="position:absolute;margin-left:-47.85pt;margin-top:13.2pt;width:54.2pt;height:28.15pt;z-index:251686400;visibility:visible;mso-wrap-style:square;mso-wrap-distance-left:9pt;mso-wrap-distance-top:0;mso-wrap-distance-right:9pt;mso-wrap-distance-bottom:0;mso-position-horizontal:absolute;mso-position-horizontal-relative:text;mso-position-vertical:absolute;mso-position-vertical-relative:text;v-text-anchor:top" o:gfxdata="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" filled="f" stroked="f">
                 <v:textbox>
                   <w:txbxContent>
                     <w:p>
@@ -11963,7 +11963,7 @@
           </mc:Choice>
           <mc:Fallback>
             <w:pict>
-              <v:group w14:anchorId="693745A4" id="Grupo 273" o:spid="_x0000_s1116" style="position:absolute;margin-left:-5.65pt;margin-top:9.15pt;width:173.95pt;height:35.1pt;z-index:251646464;mso-height-relative:margin" coordsize="22091,4462" o:gfxdata="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">
+              <v:group w14:anchorId="693745A4" id="Grupo 273" o:spid="_x0000_s1116" style="position:absolute;margin-left:-5.65pt;margin-top:9.15pt;width:173.95pt;height:35.1pt;z-index:251646464;mso-height-relative:margin" coordsize="22091,4462" o:gfxdata="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">
                 <v:roundrect id="Rectángulo redondeado 1" o:spid="_x0000_s1117" style="position:absolute;width:22091;height:4356;visibility:visible;mso-wrap-style:square;v-text-anchor:middle" arcsize="10923f" o:gfxdata="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" fillcolor="white [3212]" strokecolor="#a3389e" strokeweight="1pt">
                   <v:stroke joinstyle="miter"/>
                 </v:roundrect>
@@ -12102,7 +12102,7 @@
           </mc:Choice>
           <mc:Fallback>
             <w:pict>
-              <v:shape w14:anchorId="74B467F6" id="_x0000_s1119" type="#_x0000_t202" style="position:absolute;margin-left:364.45pt;margin-top:12.7pt;width:115.35pt;height:30.45pt;z-index:251676160;visibility:visible;mso-wrap-style:square;mso-width-percent:0;mso-height-percent:0;mso-wrap-distance-left:9pt;mso-wrap-distance-top:3.6pt;mso-wrap-distance-right:9pt;mso-wrap-distance-bottom:3.6pt;mso-position-horizontal:absolute;mso-position-horizontal-relative:margin;mso-position-vertical:absolute;mso-position-vertical-relative:text;mso-width-percent:0;mso-height-percent:0;mso-width-relative:margin;mso-height-relative:margin;v-text-anchor:top" o:gfxdata="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" filled="f" stroked="f">
+              <v:shape w14:anchorId="74B467F6" id="_x0000_s1119" type="#_x0000_t202" style="position:absolute;margin-left:364.45pt;margin-top:12.7pt;width:115.35pt;height:30.45pt;z-index:251676160;visibility:visible;mso-wrap-style:square;mso-width-percent:0;mso-height-percent:0;mso-wrap-distance-left:9pt;mso-wrap-distance-top:3.6pt;mso-wrap-distance-right:9pt;mso-wrap-distance-bottom:3.6pt;mso-position-horizontal:absolute;mso-position-horizontal-relative:margin;mso-position-vertical:absolute;mso-position-vertical-relative:text;mso-width-percent:0;mso-height-percent:0;mso-width-relative:margin;mso-height-relative:margin;v-text-anchor:top" o:gfxdata="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" filled="f" stroked="f">
                 <v:textbox>
                   <w:txbxContent>
                     <w:p>
@@ -12265,7 +12265,7 @@
           </mc:Choice>
           <mc:Fallback>
             <w:pict>
-              <v:group w14:anchorId="307CBFDA" id="Grupo 259" o:spid="_x0000_s1120" style="position:absolute;margin-left:296.15pt;margin-top:2pt;width:74.05pt;height:52.7pt;z-index:251641344" coordorigin=",-152" coordsize="9404,6692" o:gfxdata="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">
+              <v:group w14:anchorId="307CBFDA" id="Grupo 259" o:spid="_x0000_s1120" style="position:absolute;margin-left:296.15pt;margin-top:2pt;width:74.05pt;height:52.7pt;z-index:251641344" coordorigin=",-152" coordsize="9404,6692" o:gfxdata="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">
                 <v:shape id="Picture 17" o:spid="_x0000_s1121" type="#_x0000_t75" alt="f-01" style="position:absolute;top:-152;width:9404;height:6692;flip:x;visibility:visible;mso-wrap-style:square" o:gfxdata="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">
                   <v:imagedata r:id="rId30" o:title="f-01"/>
                 </v:shape>
@@ -12424,7 +12424,7 @@
           </mc:Choice>
           <mc:Fallback>
             <w:pict>
-              <v:shape w14:anchorId="706E8D63" id="Cuadro de texto 433" o:spid="_x0000_s1123" type="#_x0000_t202" style="position:absolute;margin-left:130.55pt;margin-top:14pt;width:54.2pt;height:28.15pt;z-index:251683328;visibility:visible;mso-wrap-style:square;mso-wrap-distance-left:9pt;mso-wrap-distance-top:0;mso-wrap-distance-right:9pt;mso-wrap-distance-bottom:0;mso-position-horizontal:absolute;mso-position-horizontal-relative:text;mso-position-vertical:absolute;mso-position-vertical-relative:text;v-text-anchor:top" o:gfxdata="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" filled="f" stroked="f">
+              <v:shape w14:anchorId="706E8D63" id="Cuadro de texto 433" o:spid="_x0000_s1123" type="#_x0000_t202" style="position:absolute;margin-left:130.55pt;margin-top:14pt;width:54.2pt;height:28.15pt;z-index:251683328;visibility:visible;mso-wrap-style:square;mso-wrap-distance-left:9pt;mso-wrap-distance-top:0;mso-wrap-distance-right:9pt;mso-wrap-distance-bottom:0;mso-position-horizontal:absolute;mso-position-horizontal-relative:text;mso-position-vertical:absolute;mso-position-vertical-relative:text;v-text-anchor:top" o:gfxdata="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" filled="f" stroked="f">
                 <v:textbox>
                   <w:txbxContent>
                     <w:p>
@@ -12615,7 +12615,7 @@
               </wp:anchor>
             </w:drawing>
           </mc:Choice>
-          <mc:Fallback>
+          <mc:Fallback xmlns:w16sdtfl="http://schemas.microsoft.com/office/word/2024/wordml/sdtformatlock" xmlns:w16du="http://schemas.microsoft.com/office/word/2023/wordml/word16du" xmlns:oel="http://schemas.microsoft.com/office/2019/extlst">
             <w:pict>
               <v:roundrect w14:anchorId="3454CD7A" id="Rectángulo redondeado 247" o:spid="_x0000_s1026" style="position:absolute;margin-left:357.85pt;margin-top:11.1pt;width:121.25pt;height:34.3pt;z-index:-251678208;visibility:visible;mso-wrap-style:square;mso-width-percent:0;mso-height-percent:0;mso-wrap-distance-left:9pt;mso-wrap-distance-top:0;mso-wrap-distance-right:9pt;mso-wrap-distance-bottom:0;mso-position-horizontal:absolute;mso-position-horizontal-relative:margin;mso-position-vertical:absolute;mso-position-vertical-relative:text;mso-width-percent:0;mso-height-percent:0;mso-width-relative:margin;mso-height-relative:margin;v-text-anchor:middle" arcsize="10923f" o:gfxdata="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" fillcolor="white [3212]" strokecolor="#a3389e" strokeweight="1pt">
                 <v:stroke joinstyle="miter"/>
@@ -12809,7 +12809,7 @@
               </wp:anchor>
             </w:drawing>
           </mc:Choice>
-          <mc:Fallback>
+          <mc:Fallback xmlns:w16sdtfl="http://schemas.microsoft.com/office/word/2024/wordml/sdtformatlock" xmlns:w16du="http://schemas.microsoft.com/office/word/2023/wordml/word16du" xmlns:oel="http://schemas.microsoft.com/office/2019/extlst">
             <w:pict>
               <v:group w14:anchorId="1F2168E6" id="Grupo 260" o:spid="_x0000_s1026" style="position:absolute;margin-left:224.45pt;margin-top:1.65pt;width:56.3pt;height:92.95pt;z-index:251661824" coordsize="7148,11803" o:gfxdata="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">
                 <v:shapetype id="_x0000_t104" coordsize="21600,21600" o:spt="104" adj="12960,19440,7200" path="ar0@22@3@21,,0@4@21@14@22@1@21@7@21@12@2l@13@2@8,0@11@2wa0@22@3@21@10@2@16@24@14@22@1@21@16@24@14,xewr@14@22@1@21@7@21@16@24nfe">
@@ -13019,7 +13019,7 @@
           </mc:Choice>
           <mc:Fallback>
             <w:pict>
-              <v:shape w14:anchorId="21999BEE" id="Cuadro de texto 437" o:spid="_x0000_s1124" type="#_x0000_t202" style="position:absolute;margin-left:-47.45pt;margin-top:13.75pt;width:54.2pt;height:28.15pt;z-index:251687424;visibility:visible;mso-wrap-style:square;mso-wrap-distance-left:9pt;mso-wrap-distance-top:0;mso-wrap-distance-right:9pt;mso-wrap-distance-bottom:0;mso-position-horizontal:absolute;mso-position-horizontal-relative:text;mso-position-vertical:absolute;mso-position-vertical-relative:text;v-text-anchor:top" o:gfxdata="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" filled="f" stroked="f">
+              <v:shape w14:anchorId="21999BEE" id="Cuadro de texto 437" o:spid="_x0000_s1124" type="#_x0000_t202" style="position:absolute;margin-left:-47.45pt;margin-top:13.75pt;width:54.2pt;height:28.15pt;z-index:251687424;visibility:visible;mso-wrap-style:square;mso-wrap-distance-left:9pt;mso-wrap-distance-top:0;mso-wrap-distance-right:9pt;mso-wrap-distance-bottom:0;mso-position-horizontal:absolute;mso-position-horizontal-relative:text;mso-position-vertical:absolute;mso-position-vertical-relative:text;v-text-anchor:top" o:gfxdata="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" filled="f" stroked="f">
                 <v:textbox>
                   <w:txbxContent>
                     <w:p>
@@ -13197,7 +13197,7 @@
           </mc:Choice>
           <mc:Fallback>
             <w:pict>
-              <v:shape w14:anchorId="77722F0F" id="_x0000_s1125" type="#_x0000_t202" style="position:absolute;margin-left:358.45pt;margin-top:7.5pt;width:120.4pt;height:35.5pt;z-index:251642368;visibility:visible;mso-wrap-style:square;mso-width-percent:0;mso-height-percent:0;mso-wrap-distance-left:9pt;mso-wrap-distance-top:3.6pt;mso-wrap-distance-right:9pt;mso-wrap-distance-bottom:3.6pt;mso-position-horizontal:absolute;mso-position-horizontal-relative:margin;mso-position-vertical:absolute;mso-position-vertical-relative:text;mso-width-percent:0;mso-height-percent:0;mso-width-relative:margin;mso-height-relative:margin;v-text-anchor:top" o:gfxdata="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" filled="f" stroked="f">
+              <v:shape w14:anchorId="77722F0F" id="_x0000_s1125" type="#_x0000_t202" style="position:absolute;margin-left:358.45pt;margin-top:7.5pt;width:120.4pt;height:35.5pt;z-index:251642368;visibility:visible;mso-wrap-style:square;mso-width-percent:0;mso-height-percent:0;mso-wrap-distance-left:9pt;mso-wrap-distance-top:3.6pt;mso-wrap-distance-right:9pt;mso-wrap-distance-bottom:3.6pt;mso-position-horizontal:absolute;mso-position-horizontal-relative:margin;mso-position-vertical:absolute;mso-position-vertical-relative:text;mso-width-percent:0;mso-height-percent:0;mso-width-relative:margin;mso-height-relative:margin;v-text-anchor:top" o:gfxdata="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" filled="f" stroked="f">
                 <v:textbox>
                   <w:txbxContent>
                     <w:p>
@@ -13372,7 +13372,7 @@
           </mc:Choice>
           <mc:Fallback>
             <w:pict>
-              <v:group w14:anchorId="44C138F0" id="Grupo 272" o:spid="_x0000_s1126" style="position:absolute;margin-left:-6.6pt;margin-top:7.85pt;width:174.95pt;height:37.4pt;z-index:251645440;mso-height-relative:margin" coordorigin=",165" coordsize="22218,4749" o:gfxdata="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">
+              <v:group w14:anchorId="44C138F0" id="Grupo 272" o:spid="_x0000_s1126" style="position:absolute;margin-left:-6.6pt;margin-top:7.85pt;width:174.95pt;height:37.4pt;z-index:251645440;mso-height-relative:margin" coordorigin=",165" coordsize="22218,4749" o:gfxdata="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">
                 <v:roundrect id="Rectángulo redondeado 2" o:spid="_x0000_s1127" style="position:absolute;top:165;width:22218;height:4356;visibility:visible;mso-wrap-style:square;v-text-anchor:middle" arcsize="10923f" o:gfxdata="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" fillcolor="white [3212]" strokecolor="#a3389e" strokeweight="1pt">
                   <v:stroke joinstyle="miter"/>
                 </v:roundrect>
@@ -13518,7 +13518,7 @@
           </mc:Choice>
           <mc:Fallback>
             <w:pict>
-              <v:shape w14:anchorId="58A5B50E" id="_x0000_s1129" type="#_x0000_t202" style="position:absolute;margin-left:317.35pt;margin-top:9.9pt;width:40.25pt;height:35.5pt;z-index:251684352;visibility:visible;mso-wrap-style:square;mso-wrap-distance-left:9pt;mso-wrap-distance-top:0;mso-wrap-distance-right:9pt;mso-wrap-distance-bottom:0;mso-position-horizontal:absolute;mso-position-horizontal-relative:text;mso-position-vertical:absolute;mso-position-vertical-relative:text;v-text-anchor:top" o:gfxdata="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" filled="f" stroked="f">
+              <v:shape w14:anchorId="58A5B50E" id="_x0000_s1129" type="#_x0000_t202" style="position:absolute;margin-left:317.35pt;margin-top:9.9pt;width:40.25pt;height:35.5pt;z-index:251684352;visibility:visible;mso-wrap-style:square;mso-wrap-distance-left:9pt;mso-wrap-distance-top:0;mso-wrap-distance-right:9pt;mso-wrap-distance-bottom:0;mso-position-horizontal:absolute;mso-position-horizontal-relative:text;mso-position-vertical:absolute;mso-position-vertical-relative:text;v-text-anchor:top" o:gfxdata="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" filled="f" stroked="f">
                 <v:textbox>
                   <w:txbxContent>
                     <w:p>
@@ -13682,7 +13682,7 @@
           </mc:Choice>
           <mc:Fallback>
             <w:pict>
-              <v:shape w14:anchorId="69734194" id="Cuadro de texto 432" o:spid="_x0000_s1130" type="#_x0000_t202" style="position:absolute;margin-left:132.05pt;margin-top:12.9pt;width:54.2pt;height:28.15pt;z-index:251682304;visibility:visible;mso-wrap-style:square;mso-wrap-distance-left:9pt;mso-wrap-distance-top:0;mso-wrap-distance-right:9pt;mso-wrap-distance-bottom:0;mso-position-horizontal:absolute;mso-position-horizontal-relative:text;mso-position-vertical:absolute;mso-position-vertical-relative:text;v-text-anchor:top" o:gfxdata="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" filled="f" stroked="f">
+              <v:shape w14:anchorId="69734194" id="Cuadro de texto 432" o:spid="_x0000_s1130" type="#_x0000_t202" style="position:absolute;margin-left:132.05pt;margin-top:12.9pt;width:54.2pt;height:28.15pt;z-index:251682304;visibility:visible;mso-wrap-style:square;mso-wrap-distance-left:9pt;mso-wrap-distance-top:0;mso-wrap-distance-right:9pt;mso-wrap-distance-bottom:0;mso-position-horizontal:absolute;mso-position-horizontal-relative:text;mso-position-vertical:absolute;mso-position-vertical-relative:text;v-text-anchor:top" o:gfxdata="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" filled="f" stroked="f">
                 <v:textbox>
                   <w:txbxContent>
                     <w:p>
@@ -13917,7 +13917,7 @@
               </wp:anchor>
             </w:drawing>
           </mc:Choice>
-          <mc:Fallback>
+          <mc:Fallback xmlns:w16sdtfl="http://schemas.microsoft.com/office/word/2024/wordml/sdtformatlock" xmlns:w16du="http://schemas.microsoft.com/office/word/2023/wordml/word16du" xmlns:oel="http://schemas.microsoft.com/office/2019/extlst">
             <w:pict>
               <v:roundrect w14:anchorId="2637611C" id="Rectángulo redondeado 4" o:spid="_x0000_s1026" style="position:absolute;margin-left:354.95pt;margin-top:9.1pt;width:124.05pt;height:34.3pt;z-index:-251677184;visibility:visible;mso-wrap-style:square;mso-width-percent:0;mso-height-percent:0;mso-wrap-distance-left:9pt;mso-wrap-distance-top:0;mso-wrap-distance-right:9pt;mso-wrap-distance-bottom:0;mso-position-horizontal:absolute;mso-position-horizontal-relative:margin;mso-position-vertical:absolute;mso-position-vertical-relative:text;mso-width-percent:0;mso-height-percent:0;mso-width-relative:margin;mso-height-relative:margin;v-text-anchor:middle" arcsize="10923f" o:gfxdata="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" fillcolor="white [3212]" strokecolor="#a3389e" strokeweight="1pt">
                 <v:stroke joinstyle="miter"/>
@@ -14022,7 +14022,7 @@
           </mc:Choice>
           <mc:Fallback>
             <w:pict>
-              <v:shape w14:anchorId="4E910334" id="_x0000_s1131" type="#_x0000_t202" style="position:absolute;margin-left:236.6pt;margin-top:13.95pt;width:108.5pt;height:24.15pt;rotation:-90;z-index:251650560;visibility:visible;mso-wrap-style:square;mso-width-percent:0;mso-wrap-distance-left:9pt;mso-wrap-distance-top:0;mso-wrap-distance-right:9pt;mso-wrap-distance-bottom:0;mso-position-horizontal:absolute;mso-position-horizontal-relative:margin;mso-position-vertical:absolute;mso-position-vertical-relative:text;mso-width-percent:0;mso-width-relative:margin;v-text-anchor:top" o:gfxdata="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" filled="f" stroked="f">
+              <v:shape w14:anchorId="4E910334" id="_x0000_s1131" type="#_x0000_t202" style="position:absolute;margin-left:236.6pt;margin-top:13.95pt;width:108.5pt;height:24.15pt;rotation:-90;z-index:251650560;visibility:visible;mso-wrap-style:square;mso-width-percent:0;mso-wrap-distance-left:9pt;mso-wrap-distance-top:0;mso-wrap-distance-right:9pt;mso-wrap-distance-bottom:0;mso-position-horizontal:absolute;mso-position-horizontal-relative:margin;mso-position-vertical:absolute;mso-position-vertical-relative:text;mso-width-percent:0;mso-width-relative:margin;v-text-anchor:top" o:gfxdata="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" filled="f" stroked="f">
                 <v:textbox style="mso-fit-shape-to-text:t">
                   <w:txbxContent>
                     <w:p>
@@ -14177,7 +14177,7 @@
           </mc:Choice>
           <mc:Fallback>
             <w:pict>
-              <v:shape w14:anchorId="35847DB1" id="_x0000_s1132" type="#_x0000_t202" style="position:absolute;margin-left:0;margin-top:14.95pt;width:108.5pt;height:24.15pt;rotation:90;z-index:251651584;visibility:visible;mso-wrap-style:square;mso-width-percent:0;mso-wrap-distance-left:9pt;mso-wrap-distance-top:0;mso-wrap-distance-right:9pt;mso-wrap-distance-bottom:0;mso-position-horizontal:center;mso-position-horizontal-relative:margin;mso-position-vertical:absolute;mso-position-vertical-relative:text;mso-width-percent:0;mso-width-relative:margin;v-text-anchor:top" o:gfxdata="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" filled="f" stroked="f">
+              <v:shape w14:anchorId="35847DB1" id="_x0000_s1132" type="#_x0000_t202" style="position:absolute;margin-left:0;margin-top:14.95pt;width:108.5pt;height:24.15pt;rotation:90;z-index:251651584;visibility:visible;mso-wrap-style:square;mso-width-percent:0;mso-wrap-distance-left:9pt;mso-wrap-distance-top:0;mso-wrap-distance-right:9pt;mso-wrap-distance-bottom:0;mso-position-horizontal:center;mso-position-horizontal-relative:margin;mso-position-vertical:absolute;mso-position-vertical-relative:text;mso-width-percent:0;mso-width-relative:margin;v-text-anchor:top" o:gfxdata="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" filled="f" stroked="f">
                 <v:textbox style="mso-fit-shape-to-text:t">
                   <w:txbxContent>
                     <w:p>
@@ -14438,7 +14438,7 @@
           </mc:Choice>
           <mc:Fallback>
             <w:pict>
-              <v:shape w14:anchorId="1891A290" id="Cuadro de texto 438" o:spid="_x0000_s1133" type="#_x0000_t202" style="position:absolute;margin-left:-47.85pt;margin-top:15.4pt;width:54.2pt;height:28.15pt;z-index:251688448;visibility:visible;mso-wrap-style:square;mso-wrap-distance-left:9pt;mso-wrap-distance-top:0;mso-wrap-distance-right:9pt;mso-wrap-distance-bottom:0;mso-position-horizontal:absolute;mso-position-horizontal-relative:text;mso-position-vertical:absolute;mso-position-vertical-relative:text;v-text-anchor:top" o:gfxdata="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" filled="f" stroked="f">
+              <v:shape w14:anchorId="1891A290" id="Cuadro de texto 438" o:spid="_x0000_s1133" type="#_x0000_t202" style="position:absolute;margin-left:-47.85pt;margin-top:15.4pt;width:54.2pt;height:28.15pt;z-index:251688448;visibility:visible;mso-wrap-style:square;mso-wrap-distance-left:9pt;mso-wrap-distance-top:0;mso-wrap-distance-right:9pt;mso-wrap-distance-bottom:0;mso-position-horizontal:absolute;mso-position-horizontal-relative:text;mso-position-vertical:absolute;mso-position-vertical-relative:text;v-text-anchor:top" o:gfxdata="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" filled="f" stroked="f">
                 <v:textbox>
                   <w:txbxContent>
                     <w:p>
@@ -14616,7 +14616,7 @@
           </mc:Choice>
           <mc:Fallback>
             <w:pict>
-              <v:shape w14:anchorId="5CFBDAB8" id="_x0000_s1134" type="#_x0000_t202" style="position:absolute;margin-left:363.55pt;margin-top:8.7pt;width:115.3pt;height:32.35pt;z-index:251643392;visibility:visible;mso-wrap-style:square;mso-width-percent:0;mso-height-percent:0;mso-wrap-distance-left:9pt;mso-wrap-distance-top:3.6pt;mso-wrap-distance-right:9pt;mso-wrap-distance-bottom:3.6pt;mso-position-horizontal:absolute;mso-position-horizontal-relative:margin;mso-position-vertical:absolute;mso-position-vertical-relative:text;mso-width-percent:0;mso-height-percent:0;mso-width-relative:margin;mso-height-relative:margin;v-text-anchor:top" o:gfxdata="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" filled="f" stroked="f">
+              <v:shape w14:anchorId="5CFBDAB8" id="_x0000_s1134" type="#_x0000_t202" style="position:absolute;margin-left:363.55pt;margin-top:8.7pt;width:115.3pt;height:32.35pt;z-index:251643392;visibility:visible;mso-wrap-style:square;mso-width-percent:0;mso-height-percent:0;mso-wrap-distance-left:9pt;mso-wrap-distance-top:3.6pt;mso-wrap-distance-right:9pt;mso-wrap-distance-bottom:3.6pt;mso-position-horizontal:absolute;mso-position-horizontal-relative:margin;mso-position-vertical:absolute;mso-position-vertical-relative:text;mso-width-percent:0;mso-height-percent:0;mso-width-relative:margin;mso-height-relative:margin;v-text-anchor:top" o:gfxdata="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" filled="f" stroked="f">
                 <v:textbox>
                   <w:txbxContent>
                     <w:p>
@@ -14788,7 +14788,7 @@
           </mc:Choice>
           <mc:Fallback>
             <w:pict>
-              <v:group w14:anchorId="038DB594" id="Grupo 274" o:spid="_x0000_s1135" style="position:absolute;margin-left:-8.9pt;margin-top:9.75pt;width:175.6pt;height:38.85pt;z-index:251644416" coordsize="22303,4933" o:gfxdata="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">
+              <v:group w14:anchorId="038DB594" id="Grupo 274" o:spid="_x0000_s1135" style="position:absolute;margin-left:-8.9pt;margin-top:9.75pt;width:175.6pt;height:38.85pt;z-index:251644416" coordsize="22303,4933" o:gfxdata="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">
                 <v:roundrect id="Rectángulo redondeado 3" o:spid="_x0000_s1136" style="position:absolute;top:47;width:22303;height:4356;visibility:visible;mso-wrap-style:square;v-text-anchor:middle" arcsize="10923f" o:gfxdata="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" fillcolor="white [3212]" strokecolor="#a3389e" strokeweight="1pt">
                   <v:stroke joinstyle="miter"/>
                 </v:roundrect>
@@ -14946,7 +14946,7 @@
           </mc:Choice>
           <mc:Fallback>
             <w:pict>
-              <v:shape w14:anchorId="72DEF6C5" id="_x0000_s1138" type="#_x0000_t202" style="position:absolute;margin-left:317.35pt;margin-top:11.8pt;width:40.25pt;height:35.5pt;z-index:251685376;visibility:visible;mso-wrap-style:square;mso-wrap-distance-left:9pt;mso-wrap-distance-top:0;mso-wrap-distance-right:9pt;mso-wrap-distance-bottom:0;mso-position-horizontal:absolute;mso-position-horizontal-relative:text;mso-position-vertical:absolute;mso-position-vertical-relative:text;v-text-anchor:top" o:gfxdata="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" filled="f" stroked="f">
+              <v:shape w14:anchorId="72DEF6C5" id="_x0000_s1138" type="#_x0000_t202" style="position:absolute;margin-left:317.35pt;margin-top:11.8pt;width:40.25pt;height:35.5pt;z-index:251685376;visibility:visible;mso-wrap-style:square;mso-wrap-distance-left:9pt;mso-wrap-distance-top:0;mso-wrap-distance-right:9pt;mso-wrap-distance-bottom:0;mso-position-horizontal:absolute;mso-position-horizontal-relative:text;mso-position-vertical:absolute;mso-position-vertical-relative:text;v-text-anchor:top" o:gfxdata="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" filled="f" stroked="f">
                 <v:textbox>
                   <w:txbxContent>
                     <w:p>
@@ -15133,7 +15133,7 @@
           </mc:Choice>
           <mc:Fallback>
             <w:pict>
-              <v:group w14:anchorId="58345198" id="Grupo 271" o:spid="_x0000_s1139" style="position:absolute;margin-left:124.35pt;margin-top:.85pt;width:74.05pt;height:52.7pt;z-index:251649536" coordsize="9404,6692" o:gfxdata="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">
+              <v:group w14:anchorId="58345198" id="Grupo 271" o:spid="_x0000_s1139" style="position:absolute;margin-left:124.35pt;margin-top:.85pt;width:74.05pt;height:52.7pt;z-index:251649536" coordsize="9404,6692" o:gfxdata="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">
                 <v:shape id="Picture 38" o:spid="_x0000_s1140" type="#_x0000_t75" alt="iii-01" style="position:absolute;width:9404;height:6692;visibility:visible;mso-wrap-style:square" o:gfxdata="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">
                   <v:imagedata r:id="rId34" o:title="iii-01"/>
                 </v:shape>
@@ -15301,7 +15301,7 @@
               </wp:anchor>
             </w:drawing>
           </mc:Choice>
-          <mc:Fallback>
+          <mc:Fallback xmlns:w16sdtfl="http://schemas.microsoft.com/office/word/2024/wordml/sdtformatlock" xmlns:w16du="http://schemas.microsoft.com/office/word/2023/wordml/word16du" xmlns:oel="http://schemas.microsoft.com/office/2019/extlst">
             <w:pict>
               <v:roundrect w14:anchorId="50549E3E" id="Rectángulo redondeado 6" o:spid="_x0000_s1026" style="position:absolute;margin-left:353.15pt;margin-top:8.1pt;width:125.95pt;height:34.3pt;z-index:-251676160;visibility:visible;mso-wrap-style:square;mso-width-percent:0;mso-height-percent:0;mso-wrap-distance-left:9pt;mso-wrap-distance-top:0;mso-wrap-distance-right:9pt;mso-wrap-distance-bottom:0;mso-position-horizontal:absolute;mso-position-horizontal-relative:margin;mso-position-vertical:absolute;mso-position-vertical-relative:text;mso-width-percent:0;mso-height-percent:0;mso-width-relative:margin;mso-height-relative:margin;v-text-anchor:middle" arcsize="10923f" o:gfxdata="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" fillcolor="white [3212]" strokecolor="#a3389e" strokeweight="1pt">
                 <v:stroke joinstyle="miter"/>
@@ -15401,7 +15401,7 @@
           </mc:Choice>
           <mc:Fallback>
             <w:pict>
-              <v:shape w14:anchorId="0F0CCB3B" id="Cuadro de texto 266" o:spid="_x0000_s1142" type="#_x0000_t202" style="position:absolute;margin-left:190.6pt;margin-top:67.45pt;width:44pt;height:28.15pt;z-index:251663872;visibility:visible;mso-wrap-style:square;mso-width-percent:0;mso-height-percent:0;mso-wrap-distance-left:9pt;mso-wrap-distance-top:3.6pt;mso-wrap-distance-right:9pt;mso-wrap-distance-bottom:3.6pt;mso-position-horizontal:absolute;mso-position-horizontal-relative:margin;mso-position-vertical:absolute;mso-position-vertical-relative:text;mso-width-percent:0;mso-height-percent:0;mso-width-relative:margin;mso-height-relative:margin;v-text-anchor:top" o:gfxdata="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" filled="f" stroked="f">
+              <v:shape w14:anchorId="0F0CCB3B" id="Cuadro de texto 266" o:spid="_x0000_s1142" type="#_x0000_t202" style="position:absolute;margin-left:190.6pt;margin-top:67.45pt;width:44pt;height:28.15pt;z-index:251663872;visibility:visible;mso-wrap-style:square;mso-width-percent:0;mso-height-percent:0;mso-wrap-distance-left:9pt;mso-wrap-distance-top:3.6pt;mso-wrap-distance-right:9pt;mso-wrap-distance-bottom:3.6pt;mso-position-horizontal:absolute;mso-position-horizontal-relative:margin;mso-position-vertical:absolute;mso-position-vertical-relative:text;mso-width-percent:0;mso-height-percent:0;mso-width-relative:margin;mso-height-relative:margin;v-text-anchor:top" o:gfxdata="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" filled="f" stroked="f">
                 <v:textbox>
                   <w:txbxContent>
                     <w:p>
@@ -16147,7 +16147,7 @@
           </mc:Choice>
           <mc:Fallback>
             <w:pict>
-              <v:group w14:anchorId="15C605CD" id="Grupo 492" o:spid="_x0000_s1143" style="position:absolute;margin-left:-42.25pt;margin-top:22.1pt;width:249.2pt;height:168pt;z-index:251689472" coordsize="31652,21336" o:gfxdata="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">
+              <v:group w14:anchorId="15C605CD" id="Grupo 492" o:spid="_x0000_s1143" style="position:absolute;margin-left:-42.25pt;margin-top:22.1pt;width:249.2pt;height:168pt;z-index:251689472" coordsize="31652,21336" o:gfxdata="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">
                 <v:roundrect id="Rectángulo: esquinas redondeadas 439" o:spid="_x0000_s1144" style="position:absolute;left:586;top:2403;width:31066;height:18933;visibility:visible;mso-wrap-style:square;v-text-anchor:middle" arcsize="10923f" o:gfxdata="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" fillcolor="white [3201]" strokecolor="#1995c2" strokeweight="1pt">
                   <v:stroke joinstyle="miter"/>
                   <v:textbox>
@@ -16491,7 +16491,7 @@
               </wp:anchor>
             </w:drawing>
           </mc:Choice>
-          <mc:Fallback>
+          <mc:Fallback xmlns:w16sdtfl="http://schemas.microsoft.com/office/word/2024/wordml/sdtformatlock" xmlns:w16du="http://schemas.microsoft.com/office/word/2023/wordml/word16du" xmlns:oel="http://schemas.microsoft.com/office/2019/extlst">
             <w:pict>
               <v:roundrect w14:anchorId="00434AF8" id="Rectángulo redondeado 202" o:spid="_x0000_s1026" style="position:absolute;margin-left:-64.95pt;margin-top:-21.35pt;width:556.05pt;height:570.35pt;z-index:-251659776;visibility:visible;mso-wrap-style:square;mso-width-percent:0;mso-height-percent:0;mso-wrap-distance-left:9pt;mso-wrap-distance-top:0;mso-wrap-distance-right:9pt;mso-wrap-distance-bottom:0;mso-position-horizontal:absolute;mso-position-horizontal-relative:text;mso-position-vertical:absolute;mso-position-vertical-relative:text;mso-width-percent:0;mso-height-percent:0;mso-width-relative:margin;mso-height-relative:margin;v-text-anchor:middle" arcsize="3826f" o:gfxdata="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" fillcolor="white [3212]" strokecolor="red" strokeweight="1pt">
                 <v:stroke joinstyle="miter"/>
@@ -16740,7 +16740,7 @@
               </wp:anchor>
             </w:drawing>
           </mc:Choice>
-          <mc:Fallback>
+          <mc:Fallback xmlns:w16sdtfl="http://schemas.microsoft.com/office/word/2024/wordml/sdtformatlock" xmlns:w16du="http://schemas.microsoft.com/office/word/2023/wordml/word16du" xmlns:oel="http://schemas.microsoft.com/office/2019/extlst">
             <w:pict>
               <v:group w14:anchorId="2C337B81" id="Grupo 57" o:spid="_x0000_s1026" style="position:absolute;margin-left:-46.85pt;margin-top:-33.75pt;width:264.2pt;height:30.55pt;z-index:251652608;mso-width-relative:margin" coordsize="32465,3879" o:gfxdata="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">
                 <v:group id="Grupo 58" o:spid="_x0000_s1027" style="position:absolute;width:23691;height:3879" coordsize="23693,3881" o:gfxdata="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">
@@ -16828,7 +16828,7 @@
           </mc:Choice>
           <mc:Fallback>
             <w:pict>
-              <v:shape w14:anchorId="5DCB7C53" id="_x0000_s1160" type="#_x0000_t202" style="position:absolute;margin-left:-27.25pt;margin-top:-30.7pt;width:239.7pt;height:24.15pt;z-index:251655680;visibility:visible;mso-wrap-style:square;mso-width-percent:0;mso-wrap-distance-left:9pt;mso-wrap-distance-top:0;mso-wrap-distance-right:9pt;mso-wrap-distance-bottom:0;mso-position-horizontal:absolute;mso-position-horizontal-relative:margin;mso-position-vertical:absolute;mso-position-vertical-relative:text;mso-width-percent:0;mso-width-relative:margin;v-text-anchor:top" o:gfxdata="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" filled="f" stroked="f">
+              <v:shape w14:anchorId="5DCB7C53" id="_x0000_s1160" type="#_x0000_t202" style="position:absolute;margin-left:-27.25pt;margin-top:-30.7pt;width:239.7pt;height:24.15pt;z-index:251655680;visibility:visible;mso-wrap-style:square;mso-width-percent:0;mso-wrap-distance-left:9pt;mso-wrap-distance-top:0;mso-wrap-distance-right:9pt;mso-wrap-distance-bottom:0;mso-position-horizontal:absolute;mso-position-horizontal-relative:margin;mso-position-vertical:absolute;mso-position-vertical-relative:text;mso-width-percent:0;mso-width-relative:margin;v-text-anchor:top" o:gfxdata="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" filled="f" stroked="f">
                 <v:textbox style="mso-fit-shape-to-text:t">
                   <w:txbxContent>
                     <w:p>
@@ -16934,7 +16934,7 @@
           </mc:Choice>
           <mc:Fallback>
             <w:pict>
-              <v:shape w14:anchorId="17E1DEF0" id="_x0000_s1161" type="#_x0000_t202" style="position:absolute;margin-left:21.85pt;margin-top:-41.1pt;width:32.3pt;height:24.15pt;z-index:251654656;visibility:visible;mso-wrap-style:square;mso-width-percent:0;mso-wrap-distance-left:9pt;mso-wrap-distance-top:0;mso-wrap-distance-right:9pt;mso-wrap-distance-bottom:0;mso-position-horizontal:absolute;mso-position-horizontal-relative:left-margin-area;mso-position-vertical:absolute;mso-position-vertical-relative:text;mso-width-percent:0;mso-width-relative:margin;v-text-anchor:top" o:gfxdata="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" filled="f" stroked="f">
+              <v:shape w14:anchorId="17E1DEF0" id="_x0000_s1161" type="#_x0000_t202" style="position:absolute;margin-left:21.85pt;margin-top:-41.1pt;width:32.3pt;height:24.15pt;z-index:251654656;visibility:visible;mso-wrap-style:square;mso-width-percent:0;mso-wrap-distance-left:9pt;mso-wrap-distance-top:0;mso-wrap-distance-right:9pt;mso-wrap-distance-bottom:0;mso-position-horizontal:absolute;mso-position-horizontal-relative:left-margin-area;mso-position-vertical:absolute;mso-position-vertical-relative:text;mso-width-percent:0;mso-width-relative:margin;v-text-anchor:top" o:gfxdata="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" filled="f" stroked="f">
                 <v:textbox style="mso-fit-shape-to-text:t">
                   <w:txbxContent>
                     <w:p>
@@ -17043,7 +17043,7 @@
               </wp:anchor>
             </w:drawing>
           </mc:Choice>
-          <mc:Fallback>
+          <mc:Fallback xmlns:w16sdtfl="http://schemas.microsoft.com/office/word/2024/wordml/sdtformatlock" xmlns:w16du="http://schemas.microsoft.com/office/word/2023/wordml/word16du" xmlns:oel="http://schemas.microsoft.com/office/2019/extlst">
             <w:pict>
               <v:oval w14:anchorId="7839AD15" id="Elipse 194" o:spid="_x0000_s1026" style="position:absolute;margin-left:-67.55pt;margin-top:-40.8pt;width:41.1pt;height:40.9pt;z-index:251653632;visibility:visible;mso-wrap-style:square;mso-width-percent:0;mso-height-percent:0;mso-wrap-distance-left:9pt;mso-wrap-distance-top:0;mso-wrap-distance-right:9pt;mso-wrap-distance-bottom:0;mso-position-horizontal:absolute;mso-position-horizontal-relative:margin;mso-position-vertical:absolute;mso-position-vertical-relative:text;mso-width-percent:0;mso-height-percent:0;mso-width-relative:margin;mso-height-relative:margin;v-text-anchor:middle" o:gfxdata="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" fillcolor="red" strokecolor="white [3212]" strokeweight="1pt">
                 <v:stroke joinstyle="miter"/>
@@ -17136,7 +17136,7 @@
           </mc:Choice>
           <mc:Fallback>
             <w:pict>
-              <v:roundrect w14:anchorId="1093BA97" id="Rectángulo: esquinas redondeadas 494" o:spid="_x0000_s1162" style="position:absolute;margin-left:218.55pt;margin-top:14.65pt;width:244.6pt;height:176.6pt;z-index:251707904;visibility:visible;mso-wrap-style:square;mso-height-percent:0;mso-wrap-distance-left:9pt;mso-wrap-distance-top:0;mso-wrap-distance-right:9pt;mso-wrap-distance-bottom:0;mso-position-horizontal:absolute;mso-position-horizontal-relative:text;mso-position-vertical:absolute;mso-position-vertical-relative:text;mso-height-percent:0;mso-height-relative:margin;v-text-anchor:middle" arcsize="10923f" o:gfxdata="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" fillcolor="white [3201]" strokecolor="#7e33e8" strokeweight="1pt">
+              <v:roundrect w14:anchorId="1093BA97" id="Rectángulo: esquinas redondeadas 494" o:spid="_x0000_s1162" style="position:absolute;margin-left:218.55pt;margin-top:14.65pt;width:244.6pt;height:176.6pt;z-index:251707904;visibility:visible;mso-wrap-style:square;mso-height-percent:0;mso-wrap-distance-left:9pt;mso-wrap-distance-top:0;mso-wrap-distance-right:9pt;mso-wrap-distance-bottom:0;mso-position-horizontal:absolute;mso-position-horizontal-relative:text;mso-position-vertical:absolute;mso-position-vertical-relative:text;mso-height-percent:0;mso-height-relative:margin;v-text-anchor:middle" arcsize="10923f" o:gfxdata="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" fillcolor="white [3201]" strokecolor="#7e33e8" strokeweight="1pt">
                 <v:stroke joinstyle="miter"/>
                 <v:textbox>
                   <w:txbxContent>
@@ -17407,7 +17407,7 @@
           </mc:Choice>
           <mc:Fallback>
             <w:pict>
-              <v:group w14:anchorId="72649B7F" id="Grupo 495" o:spid="_x0000_s1163" style="position:absolute;margin-left:213.8pt;margin-top:.4pt;width:247.8pt;height:38.4pt;z-index:251708928" coordorigin=",527" coordsize="31473,4876" o:gfxdata="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">
+              <v:group w14:anchorId="72649B7F" id="Grupo 495" o:spid="_x0000_s1163" style="position:absolute;margin-left:213.8pt;margin-top:.4pt;width:247.8pt;height:38.4pt;z-index:251708928" coordorigin=",527" coordsize="31473,4876" o:gfxdata="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">
                 <v:roundrect id="Rectángulo: esquinas redondeadas 496" o:spid="_x0000_s1164" style="position:absolute;left:2229;top:761;width:29244;height:4455;visibility:visible;mso-wrap-style:square;v-text-anchor:middle" arcsize=".5" o:gfxdata="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" fillcolor="#7e33e8" strokecolor="#7e33e8" strokeweight="1pt">
                   <v:stroke joinstyle="miter"/>
                 </v:roundrect>
@@ -18459,7 +18459,7 @@
           </mc:Choice>
           <mc:Fallback>
             <w:pict>
-              <v:group w14:anchorId="68859D9A" id="Grupo 30" o:spid="_x0000_s1168" style="position:absolute;margin-left:236.25pt;margin-top:3.65pt;width:207.7pt;height:125.4pt;z-index:251709952;mso-height-relative:margin" coordorigin="" coordsize="26376,15923" o:gfxdata="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">
+              <v:group w14:anchorId="68859D9A" id="Grupo 30" o:spid="_x0000_s1168" style="position:absolute;margin-left:236.25pt;margin-top:3.65pt;width:207.7pt;height:125.4pt;z-index:251709952;mso-height-relative:margin" coordorigin="" coordsize="26376,15923" o:gfxdata="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">
                 <v:group id="Grupo 500" o:spid="_x0000_s1169" style="position:absolute;width:26375;height:2649" coordorigin=",-603" coordsize="26375,6230" o:gfxdata="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">
                   <v:group id="Grupo 501" o:spid="_x0000_s1170" style="position:absolute;width:26375;height:5627" coordsize="23774,4472" o:gfxdata="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">
                     <v:rect id="Rectángulo 502" o:spid="_x0000_s1171" style="position:absolute;left:4871;width:18903;height:4472;visibility:visible;mso-wrap-style:square;v-text-anchor:middle" o:gfxdata="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" filled="f" strokecolor="#7e33e8" strokeweight="1pt">
@@ -19147,7 +19147,7 @@
           </mc:Choice>
           <mc:Fallback>
             <w:pict>
-              <v:group w14:anchorId="76093BC8" id="Grupo 461" o:spid="_x0000_s1189" style="position:absolute;margin-left:-42.15pt;margin-top:15.1pt;width:213.65pt;height:38.4pt;z-index:251691520" coordsize="27134,4876" o:gfxdata="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">
+              <v:group w14:anchorId="76093BC8" id="Grupo 461" o:spid="_x0000_s1189" style="position:absolute;margin-left:-42.15pt;margin-top:15.1pt;width:213.65pt;height:38.4pt;z-index:251691520" coordsize="27134,4876" o:gfxdata="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">
                 <v:roundrect id="Rectángulo: esquinas redondeadas 462" o:spid="_x0000_s1190" style="position:absolute;left:2230;top:762;width:24904;height:3505;visibility:visible;mso-wrap-style:square;v-text-anchor:middle" arcsize=".5" o:gfxdata="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" fillcolor="#44bb1f" strokecolor="#44bb1f" strokeweight="1pt">
                   <v:stroke joinstyle="miter"/>
                 </v:roundrect>
@@ -19326,7 +19326,7 @@
           </mc:Choice>
           <mc:Fallback>
             <w:pict>
-              <v:roundrect w14:anchorId="34E826B3" id="Rectángulo: esquinas redondeadas 460" o:spid="_x0000_s1194" style="position:absolute;margin-left:-37.6pt;margin-top:11.4pt;width:244.6pt;height:307.55pt;z-index:251690496;visibility:visible;mso-wrap-style:square;mso-height-percent:0;mso-wrap-distance-left:9pt;mso-wrap-distance-top:0;mso-wrap-distance-right:9pt;mso-wrap-distance-bottom:0;mso-position-horizontal:absolute;mso-position-horizontal-relative:text;mso-position-vertical:absolute;mso-position-vertical-relative:text;mso-height-percent:0;mso-height-relative:margin;v-text-anchor:middle" arcsize="8246f" o:gfxdata="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" fillcolor="white [3201]" strokecolor="#44bb1f" strokeweight="1pt">
+              <v:roundrect w14:anchorId="34E826B3" id="Rectángulo: esquinas redondeadas 460" o:spid="_x0000_s1194" style="position:absolute;margin-left:-37.6pt;margin-top:11.4pt;width:244.6pt;height:307.55pt;z-index:251690496;visibility:visible;mso-wrap-style:square;mso-height-percent:0;mso-wrap-distance-left:9pt;mso-wrap-distance-top:0;mso-wrap-distance-right:9pt;mso-wrap-distance-bottom:0;mso-position-horizontal:absolute;mso-position-horizontal-relative:text;mso-position-vertical:absolute;mso-position-vertical-relative:text;mso-height-percent:0;mso-height-relative:margin;v-text-anchor:middle" arcsize="8246f" o:gfxdata="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" fillcolor="white [3201]" strokecolor="#44bb1f" strokeweight="1pt">
                 <v:stroke joinstyle="miter"/>
                 <v:textbox>
                   <w:txbxContent>
@@ -19579,7 +19579,7 @@
           </mc:Choice>
           <mc:Fallback>
             <w:pict>
-              <v:group w14:anchorId="5EBEBDF7" id="Grupo 466" o:spid="_x0000_s1195" style="position:absolute;margin-left:-17.6pt;margin-top:13.15pt;width:207.7pt;height:34.15pt;z-index:251692544" coordsize="26376,4337" o:gfxdata="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">
+              <v:group w14:anchorId="5EBEBDF7" id="Grupo 466" o:spid="_x0000_s1195" style="position:absolute;margin-left:-17.6pt;margin-top:13.15pt;width:207.7pt;height:34.15pt;z-index:251692544" coordsize="26376,4337" o:gfxdata="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">
                 <v:group id="Grupo 467" o:spid="_x0000_s1196" style="position:absolute;width:26376;height:4337" coordsize="23775,3447" o:gfxdata="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">
                   <v:rect id="Rectángulo 468" o:spid="_x0000_s1197" style="position:absolute;left:4872;width:18903;height:3447;visibility:visible;mso-wrap-style:square;v-text-anchor:middle" o:gfxdata="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" filled="f" strokecolor="#44bb1f" strokeweight="1pt">
                     <v:textbox>
@@ -19861,7 +19861,7 @@
           </mc:Choice>
           <mc:Fallback>
             <w:pict>
-              <v:group w14:anchorId="4E7DE7A9" id="Grupo 36" o:spid="_x0000_s1200" style="position:absolute;margin-left:261.3pt;margin-top:19.4pt;width:185.15pt;height:200pt;z-index:251717119" coordsize="23513,25399" o:gfxdata="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">
+              <v:group w14:anchorId="4E7DE7A9" id="Grupo 36" o:spid="_x0000_s1200" style="position:absolute;margin-left:261.3pt;margin-top:19.4pt;width:185.15pt;height:200pt;z-index:251717119" coordsize="23513,25399" o:gfxdata="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">
                 <v:roundrect id="Rectángulo: esquinas redondeadas 38" o:spid="_x0000_s1201" style="position:absolute;top:623;width:23513;height:24776;visibility:visible;mso-wrap-style:square;v-text-anchor:middle" arcsize="8031f" o:gfxdata="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" fillcolor="white [3212]" strokecolor="#ffc000 [3207]" strokeweight="1pt">
                   <v:stroke joinstyle="miter"/>
                 </v:roundrect>
@@ -20158,7 +20158,7 @@
           </mc:Choice>
           <mc:Fallback>
             <w:pict>
-              <v:group w14:anchorId="2DDE2629" id="Grupo 471" o:spid="_x0000_s1204" style="position:absolute;margin-left:-17.6pt;margin-top:12.65pt;width:207.65pt;height:34.15pt;z-index:251693568" coordsize="26376,4337" o:gfxdata="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">
+              <v:group w14:anchorId="2DDE2629" id="Grupo 471" o:spid="_x0000_s1204" style="position:absolute;margin-left:-17.6pt;margin-top:12.65pt;width:207.65pt;height:34.15pt;z-index:251693568" coordsize="26376,4337" o:gfxdata="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">
                 <v:group id="Grupo 472" o:spid="_x0000_s1205" style="position:absolute;width:26376;height:4337" coordsize="23775,3447" o:gfxdata="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">
                   <v:rect id="Rectángulo 473" o:spid="_x0000_s1206" style="position:absolute;left:4872;width:18903;height:3447;visibility:visible;mso-wrap-style:square;v-text-anchor:middle" o:gfxdata="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" filled="f" strokecolor="#44bb1f" strokeweight="1pt">
                     <v:textbox>
@@ -20508,7 +20508,7 @@
           </mc:Choice>
           <mc:Fallback>
             <w:pict>
-              <v:group w14:anchorId="4C26A26E" id="Grupo 476" o:spid="_x0000_s1209" style="position:absolute;margin-left:-17.65pt;margin-top:12.6pt;width:207.65pt;height:40.35pt;z-index:251694592;mso-height-relative:margin" coordsize="26376,4337" o:gfxdata="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">
+              <v:group w14:anchorId="4C26A26E" id="Grupo 476" o:spid="_x0000_s1209" style="position:absolute;margin-left:-17.65pt;margin-top:12.6pt;width:207.65pt;height:40.35pt;z-index:251694592;mso-height-relative:margin" coordsize="26376,4337" o:gfxdata="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">
                 <v:group id="Grupo 477" o:spid="_x0000_s1210" style="position:absolute;width:26376;height:4337" coordsize="23775,3447" o:gfxdata="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">
                   <v:rect id="Rectángulo 478" o:spid="_x0000_s1211" style="position:absolute;left:4872;width:18903;height:3447;visibility:visible;mso-wrap-style:square;v-text-anchor:middle" o:gfxdata="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" filled="f" strokecolor="#44bb1f" strokeweight="1pt">
                     <v:textbox>
@@ -20858,7 +20858,7 @@
           </mc:Choice>
           <mc:Fallback>
             <w:pict>
-              <v:group w14:anchorId="356C24A0" id="Grupo 481" o:spid="_x0000_s1214" style="position:absolute;margin-left:-17.6pt;margin-top:18.1pt;width:207.65pt;height:33.3pt;z-index:251695616;mso-height-relative:margin" coordorigin="" coordsize="26375,5040" o:gfxdata="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">
+              <v:group w14:anchorId="356C24A0" id="Grupo 481" o:spid="_x0000_s1214" style="position:absolute;margin-left:-17.6pt;margin-top:18.1pt;width:207.65pt;height:33.3pt;z-index:251695616;mso-height-relative:margin" coordorigin="" coordsize="26375,5040" o:gfxdata="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">
                 <v:group id="Grupo 482" o:spid="_x0000_s1215" style="position:absolute;width:26375;height:5040" coordorigin="" coordsize="23774,4006" o:gfxdata="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">
                   <v:rect id="Rectángulo 483" o:spid="_x0000_s1216" style="position:absolute;left:4871;width:18903;height:4006;visibility:visible;mso-wrap-style:square;v-text-anchor:middle" o:gfxdata="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" filled="f" strokecolor="#44bb1f" strokeweight="1pt">
                     <v:textbox>
@@ -21219,7 +21219,7 @@
           </mc:Choice>
           <mc:Fallback>
             <w:pict>
-              <v:group w14:anchorId="4C1CE933" id="Grupo 486" o:spid="_x0000_s1219" style="position:absolute;margin-left:-17.45pt;margin-top:-5.7pt;width:207.7pt;height:39.7pt;z-index:251696640" coordsize="26374,5040" o:gfxdata="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">
+              <v:group w14:anchorId="4C1CE933" id="Grupo 486" o:spid="_x0000_s1219" style="position:absolute;margin-left:-17.45pt;margin-top:-5.7pt;width:207.7pt;height:39.7pt;z-index:251696640" coordsize="26374,5040" o:gfxdata="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">
                 <v:group id="Grupo 487" o:spid="_x0000_s1220" style="position:absolute;width:26374;height:5040" coordsize="23773,4006" o:gfxdata="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">
                   <v:rect id="Rectángulo 488" o:spid="_x0000_s1221" style="position:absolute;left:4870;width:18903;height:4006;visibility:visible;mso-wrap-style:square;v-text-anchor:middle" o:gfxdata="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" filled="f" strokecolor="#44bb1f" strokeweight="1pt">
                     <v:textbox>
@@ -21594,7 +21594,7 @@
           </mc:Choice>
           <mc:Fallback>
             <w:pict>
-              <v:group w14:anchorId="345CFCF1" id="Grupo 14" o:spid="_x0000_s1224" style="position:absolute;margin-left:-17.55pt;margin-top:22.05pt;width:207.7pt;height:33.6pt;z-index:251714048;mso-height-relative:margin" coordsize="26374,5040" o:gfxdata="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">
+              <v:group w14:anchorId="345CFCF1" id="Grupo 14" o:spid="_x0000_s1224" style="position:absolute;margin-left:-17.55pt;margin-top:22.05pt;width:207.7pt;height:33.6pt;z-index:251714048;mso-height-relative:margin" coordsize="26374,5040" o:gfxdata="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">
                 <v:group id="Grupo 15" o:spid="_x0000_s1225" style="position:absolute;width:26374;height:5040" coordsize="23773,4006" o:gfxdata="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">
                   <v:rect id="Rectángulo 16" o:spid="_x0000_s1226" style="position:absolute;left:4870;width:18903;height:4006;visibility:visible;mso-wrap-style:square;v-text-anchor:middle" o:gfxdata="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" filled="f" strokecolor="#44bb1f" strokeweight="1pt">
                     <v:textbox>
@@ -21748,7 +21748,6 @@
                               <w:spacing w:before="0" w:beforeAutospacing="0" w:after="0" w:afterAutospacing="0"/>
                               <w:jc w:val="center"/>
                             </w:pPr>
-                            <w:proofErr w:type="gramStart"/>
                             <w:r>
                               <w:rPr>
                                 <w:rFonts w:asciiTheme="minorHAnsi" w:hAnsi="Calibri" w:cstheme="minorBidi"/>
@@ -21762,7 +21761,6 @@
                               </w:rPr>
                               <w:t>MAYOR INFORMACIÓN</w:t>
                             </w:r>
-                            <w:proofErr w:type="gramEnd"/>
                           </w:p>
                         </w:txbxContent>
                       </wps:txbx>
@@ -21783,7 +21781,7 @@
           </mc:Choice>
           <mc:Fallback>
             <w:pict>
-              <v:shape w14:anchorId="7CC13340" id="_x0000_s1229" type="#_x0000_t202" style="position:absolute;margin-left:-27.45pt;margin-top:116.7pt;width:157.15pt;height:25.65pt;z-index:251673088;visibility:visible;mso-wrap-style:square;mso-width-percent:0;mso-height-percent:0;mso-wrap-distance-left:9pt;mso-wrap-distance-top:0;mso-wrap-distance-right:9pt;mso-wrap-distance-bottom:0;mso-position-horizontal:absolute;mso-position-horizontal-relative:margin;mso-position-vertical:absolute;mso-position-vertical-relative:text;mso-width-percent:0;mso-height-percent:0;mso-width-relative:margin;mso-height-relative:margin;v-text-anchor:top" o:gfxdata="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" filled="f" stroked="f">
+              <v:shape w14:anchorId="7CC13340" id="_x0000_s1229" type="#_x0000_t202" style="position:absolute;margin-left:-27.45pt;margin-top:116.7pt;width:157.15pt;height:25.65pt;z-index:251673088;visibility:visible;mso-wrap-style:square;mso-width-percent:0;mso-height-percent:0;mso-wrap-distance-left:9pt;mso-wrap-distance-top:0;mso-wrap-distance-right:9pt;mso-wrap-distance-bottom:0;mso-position-horizontal:absolute;mso-position-horizontal-relative:margin;mso-position-vertical:absolute;mso-position-vertical-relative:text;mso-width-percent:0;mso-height-percent:0;mso-width-relative:margin;mso-height-relative:margin;v-text-anchor:top" o:gfxdata="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" filled="f" stroked="f">
                 <v:textbox>
                   <w:txbxContent>
                     <w:p>
@@ -21792,7 +21790,6 @@
                         <w:spacing w:before="0" w:beforeAutospacing="0" w:after="0" w:afterAutospacing="0"/>
                         <w:jc w:val="center"/>
                       </w:pPr>
-                      <w:proofErr w:type="gramStart"/>
                       <w:r>
                         <w:rPr>
                           <w:rFonts w:asciiTheme="minorHAnsi" w:hAnsi="Calibri" w:cstheme="minorBidi"/>
@@ -21806,7 +21803,6 @@
                         </w:rPr>
                         <w:t>MAYOR INFORMACIÓN</w:t>
                       </w:r>
-                      <w:proofErr w:type="gramEnd"/>
                     </w:p>
                   </w:txbxContent>
                 </v:textbox>
@@ -21891,7 +21887,7 @@
               </wp:anchor>
             </w:drawing>
           </mc:Choice>
-          <mc:Fallback>
+          <mc:Fallback xmlns:w16sdtfl="http://schemas.microsoft.com/office/word/2024/wordml/sdtformatlock" xmlns:w16du="http://schemas.microsoft.com/office/word/2023/wordml/word16du" xmlns:oel="http://schemas.microsoft.com/office/2019/extlst">
             <w:pict>
               <v:roundrect w14:anchorId="12AEBAB8" id="Rectángulo redondeado 280" o:spid="_x0000_s1026" style="position:absolute;margin-left:-64.4pt;margin-top:133.6pt;width:371.25pt;height:121.75pt;z-index:251667968;visibility:visible;mso-wrap-style:square;mso-width-percent:0;mso-height-percent:0;mso-wrap-distance-left:9pt;mso-wrap-distance-top:0;mso-wrap-distance-right:9pt;mso-wrap-distance-bottom:0;mso-position-horizontal:absolute;mso-position-horizontal-relative:text;mso-position-vertical:absolute;mso-position-vertical-relative:text;mso-width-percent:0;mso-height-percent:0;mso-width-relative:margin;mso-height-relative:margin;v-text-anchor:middle" arcsize="10923f" o:gfxdata="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" fillcolor="white [3212]" strokecolor="#11162c" strokeweight="1pt">
                 <v:stroke joinstyle="miter"/>
@@ -22148,7 +22144,7 @@
               </wp:anchor>
             </w:drawing>
           </mc:Choice>
-          <mc:Fallback>
+          <mc:Fallback xmlns:w16sdtfl="http://schemas.microsoft.com/office/word/2024/wordml/sdtformatlock" xmlns:w16du="http://schemas.microsoft.com/office/word/2023/wordml/word16du" xmlns:oel="http://schemas.microsoft.com/office/2019/extlst">
             <w:pict>
               <v:group w14:anchorId="1001A601" id="Grupo 287" o:spid="_x0000_s1026" style="position:absolute;margin-left:-58.6pt;margin-top:113.65pt;width:264.2pt;height:30.55pt;z-index:251671040;mso-width-relative:margin" coordsize="32465,3879" o:gfxdata="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">
                 <v:group id="Grupo 288" o:spid="_x0000_s1027" style="position:absolute;width:23691;height:3879" coordsize="23693,3881" o:gfxdata="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">
@@ -22239,7 +22235,7 @@
               </wp:anchor>
             </w:drawing>
           </mc:Choice>
-          <mc:Fallback>
+          <mc:Fallback xmlns:w16sdtfl="http://schemas.microsoft.com/office/word/2024/wordml/sdtformatlock" xmlns:w16du="http://schemas.microsoft.com/office/word/2023/wordml/word16du" xmlns:oel="http://schemas.microsoft.com/office/2019/extlst">
             <w:pict>
               <v:oval w14:anchorId="5F38AA80" id="Elipse 294" o:spid="_x0000_s1026" style="position:absolute;margin-left:-69.25pt;margin-top:108.7pt;width:41.1pt;height:40.9pt;z-index:251672064;visibility:visible;mso-wrap-style:square;mso-width-percent:0;mso-height-percent:0;mso-wrap-distance-left:9pt;mso-wrap-distance-top:0;mso-wrap-distance-right:9pt;mso-wrap-distance-bottom:0;mso-position-horizontal:absolute;mso-position-horizontal-relative:margin;mso-position-vertical:absolute;mso-position-vertical-relative:text;mso-width-percent:0;mso-height-percent:0;mso-width-relative:margin;mso-height-relative:margin;v-text-anchor:middle" o:gfxdata="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" fillcolor="#11162c" strokecolor="white [3212]" strokeweight="1pt">
                 <v:stroke joinstyle="miter"/>
@@ -22480,7 +22476,7 @@
           </mc:Choice>
           <mc:Fallback>
             <w:pict>
-              <v:shape w14:anchorId="444D6589" id="Cuadro de texto 267" o:spid="_x0000_s1230" type="#_x0000_t202" style="position:absolute;margin-left:0;margin-top:291.6pt;width:44pt;height:28.15pt;z-index:251664896;visibility:visible;mso-wrap-style:square;mso-width-percent:0;mso-height-percent:0;mso-wrap-distance-left:9pt;mso-wrap-distance-top:3.6pt;mso-wrap-distance-right:9pt;mso-wrap-distance-bottom:3.6pt;mso-position-horizontal:center;mso-position-horizontal-relative:margin;mso-position-vertical:absolute;mso-position-vertical-relative:text;mso-width-percent:0;mso-height-percent:0;mso-width-relative:margin;mso-height-relative:margin;v-text-anchor:top" o:gfxdata="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" filled="f" stroked="f">
+              <v:shape w14:anchorId="444D6589" id="Cuadro de texto 267" o:spid="_x0000_s1230" type="#_x0000_t202" style="position:absolute;margin-left:0;margin-top:291.6pt;width:44pt;height:28.15pt;z-index:251664896;visibility:visible;mso-wrap-style:square;mso-width-percent:0;mso-height-percent:0;mso-wrap-distance-left:9pt;mso-wrap-distance-top:3.6pt;mso-wrap-distance-right:9pt;mso-wrap-distance-bottom:3.6pt;mso-position-horizontal:center;mso-position-horizontal-relative:margin;mso-position-vertical:absolute;mso-position-vertical-relative:text;mso-width-percent:0;mso-height-percent:0;mso-width-relative:margin;mso-height-relative:margin;v-text-anchor:top" o:gfxdata="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" filled="f" stroked="f">
                 <v:textbox>
                   <w:txbxContent>
                     <w:p>
@@ -22764,7 +22760,18 @@
                                 <w:szCs w:val="26"/>
                                 <w:lang w:val="es-CO"/>
                               </w:rPr>
-                              <w:t>317 526 4009 - 317 768 0765 - (601) 704 8103</w:t>
+                              <w:t xml:space="preserve">+57 300 9121171 </w:t>
+                            </w:r>
+                            <w:r>
+                              <w:rPr>
+                                <w:b/>
+                                <w:i/>
+                                <w:color w:val="1B223F"/>
+                                <w:sz w:val="24"/>
+                                <w:szCs w:val="26"/>
+                                <w:lang w:val="es-CO"/>
+                              </w:rPr>
+                              <w:t>- (601) 704 8103</w:t>
                             </w:r>
                           </w:p>
                           <w:p>
@@ -22836,7 +22843,7 @@
           </mc:Choice>
           <mc:Fallback>
             <w:pict>
-              <v:shape w14:anchorId="1C61CDE7" id="_x0000_s1231" type="#_x0000_t202" style="position:absolute;margin-left:-53.75pt;margin-top:40.55pt;width:242.9pt;height:96.4pt;z-index:251668992;visibility:visible;mso-wrap-style:square;mso-width-percent:0;mso-height-percent:0;mso-wrap-distance-left:9pt;mso-wrap-distance-top:3.6pt;mso-wrap-distance-right:9pt;mso-wrap-distance-bottom:3.6pt;mso-position-horizontal:absolute;mso-position-horizontal-relative:margin;mso-position-vertical:absolute;mso-position-vertical-relative:text;mso-width-percent:0;mso-height-percent:0;mso-width-relative:margin;mso-height-relative:margin;v-text-anchor:top" o:gfxdata="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" filled="f" stroked="f">
+              <v:shape w14:anchorId="1C61CDE7" id="_x0000_s1231" type="#_x0000_t202" style="position:absolute;margin-left:-53.75pt;margin-top:40.55pt;width:242.9pt;height:96.4pt;z-index:251668992;visibility:visible;mso-wrap-style:square;mso-width-percent:0;mso-height-percent:0;mso-wrap-distance-left:9pt;mso-wrap-distance-top:3.6pt;mso-wrap-distance-right:9pt;mso-wrap-distance-bottom:3.6pt;mso-position-horizontal:absolute;mso-position-horizontal-relative:margin;mso-position-vertical:absolute;mso-position-vertical-relative:text;mso-width-percent:0;mso-height-percent:0;mso-width-relative:margin;mso-height-relative:margin;v-text-anchor:top" o:gfxdata="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" filled="f" stroked="f">
                 <v:textbox>
                   <w:txbxContent>
                     <w:p>
@@ -22884,7 +22891,18 @@
                           <w:szCs w:val="26"/>
                           <w:lang w:val="es-CO"/>
                         </w:rPr>
-                        <w:t>317 526 4009 - 317 768 0765 - (601) 704 8103</w:t>
+                        <w:t xml:space="preserve">+57 300 9121171 </w:t>
+                      </w:r>
+                      <w:r>
+                        <w:rPr>
+                          <w:b/>
+                          <w:i/>
+                          <w:color w:val="1B223F"/>
+                          <w:sz w:val="24"/>
+                          <w:szCs w:val="26"/>
+                          <w:lang w:val="es-CO"/>
+                        </w:rPr>
+                        <w:t>- (601) 704 8103</w:t>
                       </w:r>
                     </w:p>
                     <w:p>
@@ -22960,7 +22978,7 @@
 </file>
 
 <file path=word/endnotes.xml><?xml version="1.0" encoding="utf-8"?>
-<w:endnotes xmlns:wpc="http://schemas.microsoft.com/office/word/2010/wordprocessingCanvas" xmlns:cx="http://schemas.microsoft.com/office/drawing/2014/chartex" xmlns:cx1="http://schemas.microsoft.com/office/drawing/2015/9/8/chartex" xmlns:cx2="http://schemas.microsoft.com/office/drawing/2015/10/21/chartex" xmlns:cx3="http://schemas.microsoft.com/office/drawing/2016/5/9/chartex" xmlns:cx4="http://schemas.microsoft.com/office/drawing/2016/5/10/chartex" xmlns:cx5="http://schemas.microsoft.com/office/drawing/2016/5/11/chartex" xmlns:cx6="http://schemas.microsoft.com/office/drawing/2016/5/12/chartex" xmlns:cx7="http://schemas.microsoft.com/office/drawing/2016/5/13/chartex" xmlns:cx8="http://schemas.microsoft.com/office/drawing/2016/5/14/chartex" xmlns:mc="http://schemas.openxmlformats.org/markup-compatibility/2006" xmlns:aink="http://schemas.microsoft.com/office/drawing/2016/ink" xmlns:am3d="http://schemas.microsoft.com/office/drawing/2017/model3d" xmlns:o="urn:schemas-microsoft-com:office:office" xmlns:oel="http://schemas.microsoft.com/office/2019/extlst" xmlns:r="http://schemas.openxmlformats.org/officeDocument/2006/relationships" xmlns:m="http://schemas.openxmlformats.org/officeDocument/2006/math" xmlns:v="urn:schemas-microsoft-com:vml" xmlns:wp14="http://schemas.microsoft.com/office/word/2010/wordprocessingDrawing" xmlns:wp="http://schemas.openxmlformats.org/drawingml/2006/wordprocessingDrawing" xmlns:w10="urn:schemas-microsoft-com:office:word" xmlns:w="http://schemas.openxmlformats.org/wordprocessingml/2006/main" xmlns:w14="http://schemas.microsoft.com/office/word/2010/wordml" xmlns:w15="http://schemas.microsoft.com/office/word/2012/wordml" xmlns:w16cex="http://schemas.microsoft.com/office/word/2018/wordml/cex" xmlns:w16cid="http://schemas.microsoft.com/office/word/2016/wordml/cid" xmlns:w16="http://schemas.microsoft.com/office/word/2018/wordml" xmlns:w16du="http://schemas.microsoft.com/office/word/2023/wordml/word16du" xmlns:w16sdtdh="http://schemas.microsoft.com/office/word/2020/wordml/sdtdatahash" xmlns:w16sdtfl="http://schemas.microsoft.com/office/word/2024/wordml/sdtformatlock" xmlns:w16se="http://schemas.microsoft.com/office/word/2015/wordml/symex" xmlns:wpg="http://schemas.microsoft.com/office/word/2010/wordprocessingGroup" xmlns:wpi="http://schemas.microsoft.com/office/word/2010/wordprocessingInk" xmlns:wne="http://schemas.microsoft.com/office/word/2006/wordml" xmlns:wps="http://schemas.microsoft.com/office/word/2010/wordprocessingShape" mc:Ignorable="w14 w15 w16se w16cid w16 w16cex w16sdtdh w16sdtfl w16du wp14">
+<w:endnotes xmlns:wpc="http://schemas.microsoft.com/office/word/2010/wordprocessingCanvas" xmlns:cx="http://schemas.microsoft.com/office/drawing/2014/chartex" xmlns:cx1="http://schemas.microsoft.com/office/drawing/2015/9/8/chartex" xmlns:cx2="http://schemas.microsoft.com/office/drawing/2015/10/21/chartex" xmlns:cx3="http://schemas.microsoft.com/office/drawing/2016/5/9/chartex" xmlns:cx4="http://schemas.microsoft.com/office/drawing/2016/5/10/chartex" xmlns:cx5="http://schemas.microsoft.com/office/drawing/2016/5/11/chartex" xmlns:cx6="http://schemas.microsoft.com/office/drawing/2016/5/12/chartex" xmlns:cx7="http://schemas.microsoft.com/office/drawing/2016/5/13/chartex" xmlns:cx8="http://schemas.microsoft.com/office/drawing/2016/5/14/chartex" xmlns:mc="http://schemas.openxmlformats.org/markup-compatibility/2006" xmlns:aink="http://schemas.microsoft.com/office/drawing/2016/ink" xmlns:am3d="http://schemas.microsoft.com/office/drawing/2017/model3d" xmlns:o="urn:schemas-microsoft-com:office:office" xmlns:r="http://schemas.openxmlformats.org/officeDocument/2006/relationships" xmlns:m="http://schemas.openxmlformats.org/officeDocument/2006/math" xmlns:v="urn:schemas-microsoft-com:vml" xmlns:wp14="http://schemas.microsoft.com/office/word/2010/wordprocessingDrawing" xmlns:wp="http://schemas.openxmlformats.org/drawingml/2006/wordprocessingDrawing" xmlns:w10="urn:schemas-microsoft-com:office:word" xmlns:w="http://schemas.openxmlformats.org/wordprocessingml/2006/main" xmlns:w14="http://schemas.microsoft.com/office/word/2010/wordml" xmlns:w15="http://schemas.microsoft.com/office/word/2012/wordml" xmlns:w16cex="http://schemas.microsoft.com/office/word/2018/wordml/cex" xmlns:w16cid="http://schemas.microsoft.com/office/word/2016/wordml/cid" xmlns:w16="http://schemas.microsoft.com/office/word/2018/wordml" xmlns:w16sdtdh="http://schemas.microsoft.com/office/word/2020/wordml/sdtdatahash" xmlns:w16se="http://schemas.microsoft.com/office/word/2015/wordml/symex" xmlns:wpg="http://schemas.microsoft.com/office/word/2010/wordprocessingGroup" xmlns:wpi="http://schemas.microsoft.com/office/word/2010/wordprocessingInk" xmlns:wne="http://schemas.microsoft.com/office/word/2006/wordml" xmlns:wps="http://schemas.microsoft.com/office/word/2010/wordprocessingShape" mc:Ignorable="w14 w15 w16se w16cid w16 w16cex w16sdtdh wp14">
   <w:endnote w:type="separator" w:id="-1">
     <w:p>
       <w:pPr>
@@ -22985,7 +23003,7 @@
 </file>
 
 <file path=word/footnotes.xml><?xml version="1.0" encoding="utf-8"?>
-<w:footnotes xmlns:wpc="http://schemas.microsoft.com/office/word/2010/wordprocessingCanvas" xmlns:cx="http://schemas.microsoft.com/office/drawing/2014/chartex" xmlns:cx1="http://schemas.microsoft.com/office/drawing/2015/9/8/chartex" xmlns:cx2="http://schemas.microsoft.com/office/drawing/2015/10/21/chartex" xmlns:cx3="http://schemas.microsoft.com/office/drawing/2016/5/9/chartex" xmlns:cx4="http://schemas.microsoft.com/office/drawing/2016/5/10/chartex" xmlns:cx5="http://schemas.microsoft.com/office/drawing/2016/5/11/chartex" xmlns:cx6="http://schemas.microsoft.com/office/drawing/2016/5/12/chartex" xmlns:cx7="http://schemas.microsoft.com/office/drawing/2016/5/13/chartex" xmlns:cx8="http://schemas.microsoft.com/office/drawing/2016/5/14/chartex" xmlns:mc="http://schemas.openxmlformats.org/markup-compatibility/2006" xmlns:aink="http://schemas.microsoft.com/office/drawing/2016/ink" xmlns:am3d="http://schemas.microsoft.com/office/drawing/2017/model3d" xmlns:o="urn:schemas-microsoft-com:office:office" xmlns:oel="http://schemas.microsoft.com/office/2019/extlst" xmlns:r="http://schemas.openxmlformats.org/officeDocument/2006/relationships" xmlns:m="http://schemas.openxmlformats.org/officeDocument/2006/math" xmlns:v="urn:schemas-microsoft-com:vml" xmlns:wp14="http://schemas.microsoft.com/office/word/2010/wordprocessingDrawing" xmlns:wp="http://schemas.openxmlformats.org/drawingml/2006/wordprocessingDrawing" xmlns:w10="urn:schemas-microsoft-com:office:word" xmlns:w="http://schemas.openxmlformats.org/wordprocessingml/2006/main" xmlns:w14="http://schemas.microsoft.com/office/word/2010/wordml" xmlns:w15="http://schemas.microsoft.com/office/word/2012/wordml" xmlns:w16cex="http://schemas.microsoft.com/office/word/2018/wordml/cex" xmlns:w16cid="http://schemas.microsoft.com/office/word/2016/wordml/cid" xmlns:w16="http://schemas.microsoft.com/office/word/2018/wordml" xmlns:w16du="http://schemas.microsoft.com/office/word/2023/wordml/word16du" xmlns:w16sdtdh="http://schemas.microsoft.com/office/word/2020/wordml/sdtdatahash" xmlns:w16sdtfl="http://schemas.microsoft.com/office/word/2024/wordml/sdtformatlock" xmlns:w16se="http://schemas.microsoft.com/office/word/2015/wordml/symex" xmlns:wpg="http://schemas.microsoft.com/office/word/2010/wordprocessingGroup" xmlns:wpi="http://schemas.microsoft.com/office/word/2010/wordprocessingInk" xmlns:wne="http://schemas.microsoft.com/office/word/2006/wordml" xmlns:wps="http://schemas.microsoft.com/office/word/2010/wordprocessingShape" mc:Ignorable="w14 w15 w16se w16cid w16 w16cex w16sdtdh w16sdtfl w16du wp14">
+<w:footnotes xmlns:wpc="http://schemas.microsoft.com/office/word/2010/wordprocessingCanvas" xmlns:cx="http://schemas.microsoft.com/office/drawing/2014/chartex" xmlns:cx1="http://schemas.microsoft.com/office/drawing/2015/9/8/chartex" xmlns:cx2="http://schemas.microsoft.com/office/drawing/2015/10/21/chartex" xmlns:cx3="http://schemas.microsoft.com/office/drawing/2016/5/9/chartex" xmlns:cx4="http://schemas.microsoft.com/office/drawing/2016/5/10/chartex" xmlns:cx5="http://schemas.microsoft.com/office/drawing/2016/5/11/chartex" xmlns:cx6="http://schemas.microsoft.com/office/drawing/2016/5/12/chartex" xmlns:cx7="http://schemas.microsoft.com/office/drawing/2016/5/13/chartex" xmlns:cx8="http://schemas.microsoft.com/office/drawing/2016/5/14/chartex" xmlns:mc="http://schemas.openxmlformats.org/markup-compatibility/2006" xmlns:aink="http://schemas.microsoft.com/office/drawing/2016/ink" xmlns:am3d="http://schemas.microsoft.com/office/drawing/2017/model3d" xmlns:o="urn:schemas-microsoft-com:office:office" xmlns:r="http://schemas.openxmlformats.org/officeDocument/2006/relationships" xmlns:m="http://schemas.openxmlformats.org/officeDocument/2006/math" xmlns:v="urn:schemas-microsoft-com:vml" xmlns:wp14="http://schemas.microsoft.com/office/word/2010/wordprocessingDrawing" xmlns:wp="http://schemas.openxmlformats.org/drawingml/2006/wordprocessingDrawing" xmlns:w10="urn:schemas-microsoft-com:office:word" xmlns:w="http://schemas.openxmlformats.org/wordprocessingml/2006/main" xmlns:w14="http://schemas.microsoft.com/office/word/2010/wordml" xmlns:w15="http://schemas.microsoft.com/office/word/2012/wordml" xmlns:w16cex="http://schemas.microsoft.com/office/word/2018/wordml/cex" xmlns:w16cid="http://schemas.microsoft.com/office/word/2016/wordml/cid" xmlns:w16="http://schemas.microsoft.com/office/word/2018/wordml" xmlns:w16sdtdh="http://schemas.microsoft.com/office/word/2020/wordml/sdtdatahash" xmlns:w16se="http://schemas.microsoft.com/office/word/2015/wordml/symex" xmlns:wpg="http://schemas.microsoft.com/office/word/2010/wordprocessingGroup" xmlns:wpi="http://schemas.microsoft.com/office/word/2010/wordprocessingInk" xmlns:wne="http://schemas.microsoft.com/office/word/2006/wordml" xmlns:wps="http://schemas.microsoft.com/office/word/2010/wordprocessingShape" mc:Ignorable="w14 w15 w16se w16cid w16 w16cex w16sdtdh wp14">
   <w:footnote w:type="separator" w:id="-1">
     <w:p>
       <w:pPr>
@@ -23010,10 +23028,10 @@
 </file>
 
 <file path=word/numbering.xml><?xml version="1.0" encoding="utf-8"?>
-<w:numbering xmlns:wpc="http://schemas.microsoft.com/office/word/2010/wordprocessingCanvas" xmlns:cx="http://schemas.microsoft.com/office/drawing/2014/chartex" xmlns:cx1="http://schemas.microsoft.com/office/drawing/2015/9/8/chartex" xmlns:cx2="http://schemas.microsoft.com/office/drawing/2015/10/21/chartex" xmlns:cx3="http://schemas.microsoft.com/office/drawing/2016/5/9/chartex" xmlns:cx4="http://schemas.microsoft.com/office/drawing/2016/5/10/chartex" xmlns:cx5="http://schemas.microsoft.com/office/drawing/2016/5/11/chartex" xmlns:cx6="http://schemas.microsoft.com/office/drawing/2016/5/12/chartex" xmlns:cx7="http://schemas.microsoft.com/office/drawing/2016/5/13/chartex" xmlns:cx8="http://schemas.microsoft.com/office/drawing/2016/5/14/chartex" xmlns:mc="http://schemas.openxmlformats.org/markup-compatibility/2006" xmlns:aink="http://schemas.microsoft.com/office/drawing/2016/ink" xmlns:am3d="http://schemas.microsoft.com/office/drawing/2017/model3d" xmlns:o="urn:schemas-microsoft-com:office:office" xmlns:oel="http://schemas.microsoft.com/office/2019/extlst" xmlns:r="http://schemas.openxmlformats.org/officeDocument/2006/relationships" xmlns:m="http://schemas.openxmlformats.org/officeDocument/2006/math" xmlns:v="urn:schemas-microsoft-com:vml" xmlns:wp14="http://schemas.microsoft.com/office/word/2010/wordprocessingDrawing" xmlns:wp="http://schemas.openxmlformats.org/drawingml/2006/wordprocessingDrawing" xmlns:w10="urn:schemas-microsoft-com:office:word" xmlns:w="http://schemas.openxmlformats.org/wordprocessingml/2006/main" xmlns:w14="http://schemas.microsoft.com/office/word/2010/wordml" xmlns:w15="http://schemas.microsoft.com/office/word/2012/wordml" xmlns:w16cex="http://schemas.microsoft.com/office/word/2018/wordml/cex" xmlns:w16cid="http://schemas.microsoft.com/office/word/2016/wordml/cid" xmlns:w16="http://schemas.microsoft.com/office/word/2018/wordml" xmlns:w16du="http://schemas.microsoft.com/office/word/2023/wordml/word16du" xmlns:w16sdtdh="http://schemas.microsoft.com/office/word/2020/wordml/sdtdatahash" xmlns:w16sdtfl="http://schemas.microsoft.com/office/word/2024/wordml/sdtformatlock" xmlns:w16se="http://schemas.microsoft.com/office/word/2015/wordml/symex" xmlns:wpg="http://schemas.microsoft.com/office/word/2010/wordprocessingGroup" xmlns:wpi="http://schemas.microsoft.com/office/word/2010/wordprocessingInk" xmlns:wne="http://schemas.microsoft.com/office/word/2006/wordml" xmlns:wps="http://schemas.microsoft.com/office/word/2010/wordprocessingShape" mc:Ignorable="w14 w15 w16se w16cid w16 w16cex w16sdtdh w16sdtfl w16du wp14">
+<w:numbering xmlns:wpc="http://schemas.microsoft.com/office/word/2010/wordprocessingCanvas" xmlns:cx="http://schemas.microsoft.com/office/drawing/2014/chartex" xmlns:cx1="http://schemas.microsoft.com/office/drawing/2015/9/8/chartex" xmlns:cx2="http://schemas.microsoft.com/office/drawing/2015/10/21/chartex" xmlns:cx3="http://schemas.microsoft.com/office/drawing/2016/5/9/chartex" xmlns:cx4="http://schemas.microsoft.com/office/drawing/2016/5/10/chartex" xmlns:cx5="http://schemas.microsoft.com/office/drawing/2016/5/11/chartex" xmlns:cx6="http://schemas.microsoft.com/office/drawing/2016/5/12/chartex" xmlns:cx7="http://schemas.microsoft.com/office/drawing/2016/5/13/chartex" xmlns:cx8="http://schemas.microsoft.com/office/drawing/2016/5/14/chartex" xmlns:mc="http://schemas.openxmlformats.org/markup-compatibility/2006" xmlns:aink="http://schemas.microsoft.com/office/drawing/2016/ink" xmlns:am3d="http://schemas.microsoft.com/office/drawing/2017/model3d" xmlns:o="urn:schemas-microsoft-com:office:office" xmlns:r="http://schemas.openxmlformats.org/officeDocument/2006/relationships" xmlns:m="http://schemas.openxmlformats.org/officeDocument/2006/math" xmlns:v="urn:schemas-microsoft-com:vml" xmlns:wp14="http://schemas.microsoft.com/office/word/2010/wordprocessingDrawing" xmlns:wp="http://schemas.openxmlformats.org/drawingml/2006/wordprocessingDrawing" xmlns:w10="urn:schemas-microsoft-com:office:word" xmlns:w="http://schemas.openxmlformats.org/wordprocessingml/2006/main" xmlns:w14="http://schemas.microsoft.com/office/word/2010/wordml" xmlns:w15="http://schemas.microsoft.com/office/word/2012/wordml" xmlns:w16cex="http://schemas.microsoft.com/office/word/2018/wordml/cex" xmlns:w16cid="http://schemas.microsoft.com/office/word/2016/wordml/cid" xmlns:w16="http://schemas.microsoft.com/office/word/2018/wordml" xmlns:w16sdtdh="http://schemas.microsoft.com/office/word/2020/wordml/sdtdatahash" xmlns:w16se="http://schemas.microsoft.com/office/word/2015/wordml/symex" xmlns:wpg="http://schemas.microsoft.com/office/word/2010/wordprocessingGroup" xmlns:wpi="http://schemas.microsoft.com/office/word/2010/wordprocessingInk" xmlns:wne="http://schemas.microsoft.com/office/word/2006/wordml" xmlns:wps="http://schemas.microsoft.com/office/word/2010/wordprocessingShape" mc:Ignorable="w14 w15 w16se w16cid w16 w16cex w16sdtdh wp14">
   <w:numPicBullet w:numPicBulletId="0">
     <w:pict>
-      <v:shapetype w14:anchorId="25545936" id="_x0000_t75" coordsize="21600,21600" o:spt="75" o:preferrelative="t" path="m@4@5l@4@11@9@11@9@5xe" filled="f" stroked="f">
+      <v:shapetype id="_x0000_t75" coordsize="21600,21600" o:spt="75" o:preferrelative="t" path="m@4@5l@4@11@9@11@9@5xe" filled="f" stroked="f">
         <v:stroke joinstyle="miter"/>
         <v:formulas>
           <v:f eqn="if lineDrawn pixelLineWidth 0"/>
@@ -23032,7 +23050,7 @@
         <v:path o:extrusionok="f" gradientshapeok="t" o:connecttype="rect"/>
         <o:lock v:ext="edit" aspectratio="t"/>
       </v:shapetype>
-      <v:shape id="_x0000_i1025" type="#_x0000_t75" style="width:11.25pt;height:11.25pt" o:bullet="t">
+      <v:shape id="_x0000_i1041" type="#_x0000_t75" style="width:11.25pt;height:11.25pt" o:bullet="t">
         <v:imagedata r:id="rId1" o:title="msoFFDE"/>
       </v:shape>
     </w:pict>
@@ -23240,17 +23258,17 @@
       </w:pPr>
     </w:lvl>
   </w:abstractNum>
-  <w:num w:numId="1" w16cid:durableId="974988832">
+  <w:num w:numId="1">
     <w:abstractNumId w:val="0"/>
   </w:num>
-  <w:num w:numId="2" w16cid:durableId="1445996891">
+  <w:num w:numId="2">
     <w:abstractNumId w:val="1"/>
   </w:num>
 </w:numbering>
 </file>
 
 <file path=word/styles.xml><?xml version="1.0" encoding="utf-8"?>
-<w:styles xmlns:mc="http://schemas.openxmlformats.org/markup-compatibility/2006" xmlns:r="http://schemas.openxmlformats.org/officeDocument/2006/relationships" xmlns:w="http://schemas.openxmlformats.org/wordprocessingml/2006/main" xmlns:w14="http://schemas.microsoft.com/office/word/2010/wordml" xmlns:w15="http://schemas.microsoft.com/office/word/2012/wordml" xmlns:w16cex="http://schemas.microsoft.com/office/word/2018/wordml/cex" xmlns:w16cid="http://schemas.microsoft.com/office/word/2016/wordml/cid" xmlns:w16="http://schemas.microsoft.com/office/word/2018/wordml" xmlns:w16du="http://schemas.microsoft.com/office/word/2023/wordml/word16du" xmlns:w16sdtdh="http://schemas.microsoft.com/office/word/2020/wordml/sdtdatahash" xmlns:w16sdtfl="http://schemas.microsoft.com/office/word/2024/wordml/sdtformatlock" xmlns:w16se="http://schemas.microsoft.com/office/word/2015/wordml/symex" mc:Ignorable="w14 w15 w16se w16cid w16 w16cex w16sdtdh w16sdtfl w16du">
+<w:styles xmlns:mc="http://schemas.openxmlformats.org/markup-compatibility/2006" xmlns:r="http://schemas.openxmlformats.org/officeDocument/2006/relationships" xmlns:w="http://schemas.openxmlformats.org/wordprocessingml/2006/main" xmlns:w14="http://schemas.microsoft.com/office/word/2010/wordml" xmlns:w15="http://schemas.microsoft.com/office/word/2012/wordml" xmlns:w16cex="http://schemas.microsoft.com/office/word/2018/wordml/cex" xmlns:w16cid="http://schemas.microsoft.com/office/word/2016/wordml/cid" xmlns:w16="http://schemas.microsoft.com/office/word/2018/wordml" xmlns:w16sdtdh="http://schemas.microsoft.com/office/word/2020/wordml/sdtdatahash" xmlns:w16se="http://schemas.microsoft.com/office/word/2015/wordml/symex" mc:Ignorable="w14 w15 w16se w16cid w16 w16cex w16sdtdh">
   <w:docDefaults>
     <w:rPrDefault>
       <w:rPr>

</xml_diff>